<commit_message>
Actualiza dashboard lun 20/07/2026  8:58:05,48
</commit_message>
<xml_diff>
--- a/Memoria/Memoria.docx
+++ b/Memoria/Memoria.docx
@@ -37,7 +37,7 @@
         <w:pStyle w:val="FirstParagraph"/>
       </w:pPr>
       <w:r>
-        <w:t xml:space="preserve">Un dashboard HTML autocontenido (un solo archivo, se abre en cualquier navegador y se aloja en GitHub Pages) que resume el Forecast de compra-venta mensual de Electroestrada para que cualquiera lo entienda de un vistazo. Todo se calcula desde los Excel; no depende de hojas auxiliares.</w:t>
+        <w:t xml:space="preserve">HTML autocontenido (un archivo) que resume el Forecast de compra-venta mensual, publicado en GitHub Pages. Todo se calcula desde los Excel; no depende de hojas auxiliares.</w:t>
       </w:r>
     </w:p>
     <w:p>
@@ -54,7 +54,7 @@
         <w:t xml:space="preserve"> </w:t>
       </w:r>
       <w:r>
-        <w:t xml:space="preserve">https://erik07-ee.github.io/Dashboard-Forecast/Dashboard_Forecast.html</w:t>
+        <w:t xml:space="preserve">https://erik07-ee.github.io/Dashboard-Forecast/Dashboard_Forecast.html ·</w:t>
       </w:r>
       <w:r>
         <w:t xml:space="preserve"> </w:t>
@@ -100,7 +100,7 @@
         <w:t xml:space="preserve"> </w:t>
       </w:r>
       <w:r>
-        <w:t xml:space="preserve">→ hoja</w:t>
+        <w:t xml:space="preserve">(hoja</w:t>
       </w:r>
       <w:r>
         <w:t xml:space="preserve"> </w:t>
@@ -112,10 +112,7 @@
         <w:t xml:space="preserve">Forecast</w:t>
       </w:r>
       <w:r>
-        <w:t xml:space="preserve"> </w:t>
-      </w:r>
-      <w:r>
-        <w:t xml:space="preserve">(stock, ventas proyectadas, compras, IMPO, estacionalidad, tendencia, venta real).</w:t>
+        <w:t xml:space="preserve">): stock, ventas proyectadas, compras, IMPO, estacionalidad, tendencia, venta real (AB–AM), precio ponderado (MIX, col AS).</w:t>
       </w:r>
     </w:p>
     <w:p>
@@ -136,7 +133,7 @@
         <w:t xml:space="preserve"> </w:t>
       </w:r>
       <w:r>
-        <w:t xml:space="preserve">→ hoja</w:t>
+        <w:t xml:space="preserve">(hoja</w:t>
       </w:r>
       <w:r>
         <w:t xml:space="preserve"> </w:t>
@@ -148,10 +145,22 @@
         <w:t xml:space="preserve">General</w:t>
       </w:r>
       <w:r>
-        <w:t xml:space="preserve"> </w:t>
-      </w:r>
-      <w:r>
-        <w:t xml:space="preserve">(Costo, Lista, CMM, Moneda por código).</w:t>
+        <w:t xml:space="preserve">): Costo=AC, Lista actual (Lista 1)=J, Moneda=I, Q=17 (lista nueva, uso futuro). La CMM ya</w:t>
+      </w:r>
+      <w:r>
+        <w:t xml:space="preserve"> </w:t>
+      </w:r>
+      <w:r>
+        <w:rPr>
+          <w:b/>
+        </w:rPr>
+        <w:t xml:space="preserve">no</w:t>
+      </w:r>
+      <w:r>
+        <w:t xml:space="preserve"> </w:t>
+      </w:r>
+      <w:r>
+        <w:t xml:space="preserve">se lee de Costos: la calcula el dashboard con Lista 1.</w:t>
       </w:r>
     </w:p>
     <w:p>
@@ -172,16 +181,37 @@
         <w:t xml:space="preserve"> </w:t>
       </w:r>
       <w:r>
-        <w:t xml:space="preserve">(archivos mensuales congelados de la misma carpeta) → sólo para la pestaña Histórico.</w:t>
+        <w:t xml:space="preserve">(archivos mensuales congelados, misma carpeta): para el Histórico — VP del mes y precio MIX (se leen 1 vez y quedan en cache).</w:t>
+      </w:r>
+    </w:p>
+    <w:p>
+      <w:pPr>
+        <w:numPr>
+          <w:ilvl w:val="0"/>
+          <w:numId w:val="1001"/>
+        </w:numPr>
+        <w:pStyle w:val="Compact"/>
+      </w:pPr>
+      <w:r>
+        <w:rPr>
+          <w:b/>
+        </w:rPr>
+        <w:t xml:space="preserve">Venta_real*.xlsx</w:t>
+      </w:r>
+      <w:r>
+        <w:t xml:space="preserve"> </w:t>
+      </w:r>
+      <w:r>
+        <w:t xml:space="preserve">(misma carpeta): venta real facturada por código y mes (USD), alimenta la V.R. $-USD del Histórico.</w:t>
       </w:r>
     </w:p>
     <w:p>
       <w:pPr>
         <w:pStyle w:val="Heading3"/>
       </w:pPr>
-      <w:bookmarkStart w:id="24" w:name="las-4-pestañas"/>
-      <w:r>
-        <w:t xml:space="preserve">Las 4 pestañas</w:t>
+      <w:bookmarkStart w:id="24" w:name="Xb5c03af40887c7c77f6b9e85d6e722e7eca289c"/>
+      <w:r>
+        <w:t xml:space="preserve">Las 4 pestañas (con filtros globales UN→GA→Categoría→Código)</w:t>
       </w:r>
       <w:bookmarkEnd w:id="24"/>
     </w:p>
@@ -203,7 +233,7 @@
         <w:t xml:space="preserve"> </w:t>
       </w:r>
       <w:r>
-        <w:t xml:space="preserve">— Tabla por código: situación actual (stock, meses de cobertura) y para 12 meses: stock inicio, meses inicio, compra, venta proyectada, stock final, meses fin. Arriba, panel de pedidos de importación (IMPO) por mes con su cobertura (donut VP/stock).</w:t>
+        <w:t xml:space="preserve">— Tabla por código: stock, meses, y por mes stock inicio/meses/compra/VP/stock final/meses fin. Panel IMPO por mes. Ventana de 4 meses con flechas ◀▶.</w:t>
       </w:r>
     </w:p>
     <w:p>
@@ -224,67 +254,7 @@
         <w:t xml:space="preserve"> </w:t>
       </w:r>
       <w:r>
-        <w:t xml:space="preserve">— Muestra sólo códigos con</w:t>
-      </w:r>
-      <w:r>
-        <w:t xml:space="preserve"> </w:t>
-      </w:r>
-      <w:r>
-        <w:rPr>
-          <w:b/>
-        </w:rPr>
-        <w:t xml:space="preserve">exceso positivo</w:t>
-      </w:r>
-      <w:r>
-        <w:t xml:space="preserve"> </w:t>
-      </w:r>
-      <w:r>
-        <w:t xml:space="preserve">(método B). Segmentos: Artículos · Stock/Meses ·</w:t>
-      </w:r>
-      <w:r>
-        <w:t xml:space="preserve"> </w:t>
-      </w:r>
-      <w:r>
-        <w:rPr>
-          <w:b/>
-        </w:rPr>
-        <w:t xml:space="preserve">Unitario USD/%</w:t>
-      </w:r>
-      <w:r>
-        <w:t xml:space="preserve"> </w:t>
-      </w:r>
-      <w:r>
-        <w:t xml:space="preserve">(Costo, CMM, Lista 1, Precio ponderado, PV mínimo) ·</w:t>
-      </w:r>
-      <w:r>
-        <w:t xml:space="preserve"> </w:t>
-      </w:r>
-      <w:r>
-        <w:rPr>
-          <w:b/>
-        </w:rPr>
-        <w:t xml:space="preserve">Total USD/%</w:t>
-      </w:r>
-      <w:r>
-        <w:t xml:space="preserve"> </w:t>
-      </w:r>
-      <w:r>
-        <w:t xml:space="preserve">(Costo total, Ponderado total) ·</w:t>
-      </w:r>
-      <w:r>
-        <w:t xml:space="preserve"> </w:t>
-      </w:r>
-      <w:r>
-        <w:rPr>
-          <w:b/>
-        </w:rPr>
-        <w:t xml:space="preserve">Contribución marginal por %</w:t>
-      </w:r>
-      <w:r>
-        <w:t xml:space="preserve"> </w:t>
-      </w:r>
-      <w:r>
-        <w:t xml:space="preserve">(colapsable). Debajo, 3 gráficos de excedente (unidades, costo, precio ponderado). Genera preview + Excel (formato Contabilidad) para clientes.</w:t>
+        <w:t xml:space="preserve">— Candidatos con exceso positivo. Preview + Excel (idénticos). Segmentos: Producto (Grupo, Código, Cat., Ideal, VP, Costo, CMM, Lista Base, Lista Mix), Exceso stock (Stock U., Exceso U., Meses de stock, Exceso meses), Exceso $-USD (Costo total, Mix total), Liquidación (Dto. Máx., Lista Dto. Máx., Dto. Liq., Mix total Liq., CMM Liq.), Contribución marginal por % (colapsable). Totales arriba. 3 gráficos de excedente (unidades/costo/precio Mix) sobre el stock total filtrado. Ordenamiento por click (Costo total / Mix total / Exceso mes → mayor a menor; Código → limpiar).</w:t>
       </w:r>
     </w:p>
     <w:p>
@@ -299,91 +269,13 @@
         <w:rPr>
           <w:b/>
         </w:rPr>
-        <w:t xml:space="preserve">Proyección VP</w:t>
-      </w:r>
-      <w:r>
-        <w:t xml:space="preserve"> </w:t>
-      </w:r>
-      <w:r>
-        <w:t xml:space="preserve">— Por GA/categoría/código y por mes:</w:t>
-      </w:r>
-      <w:r>
-        <w:t xml:space="preserve"> </w:t>
-      </w:r>
-      <w:r>
-        <w:rPr>
-          <w:b/>
-        </w:rPr>
-        <w:t xml:space="preserve">VA c/stk</w:t>
-      </w:r>
-      <w:r>
-        <w:t xml:space="preserve">, %, V.P. u,</w:t>
-      </w:r>
-      <w:r>
-        <w:t xml:space="preserve"> </w:t>
-      </w:r>
-      <w:r>
-        <w:rPr>
-          <w:b/>
-        </w:rPr>
-        <w:t xml:space="preserve">CMV</w:t>
-      </w:r>
-      <w:r>
-        <w:t xml:space="preserve">,</w:t>
-      </w:r>
-      <w:r>
-        <w:t xml:space="preserve"> </w:t>
-      </w:r>
-      <w:r>
-        <w:rPr>
-          <w:b/>
-        </w:rPr>
-        <w:t xml:space="preserve">CMV/Vta</w:t>
-      </w:r>
-      <w:r>
-        <w:t xml:space="preserve">, Venta $-USD, y tendencia mensual/anual. En el encabezado del mes: TC editable,</w:t>
-      </w:r>
-      <w:r>
-        <w:t xml:space="preserve"> </w:t>
-      </w:r>
-      <w:r>
-        <w:rPr>
-          <w:b/>
-        </w:rPr>
-        <w:t xml:space="preserve">CMV</w:t>
-      </w:r>
-      <w:r>
-        <w:t xml:space="preserve"> </w:t>
-      </w:r>
-      <w:r>
-        <w:t xml:space="preserve">(rojo),</w:t>
-      </w:r>
-      <w:r>
-        <w:t xml:space="preserve"> </w:t>
-      </w:r>
-      <w:r>
-        <w:rPr>
-          <w:b/>
-        </w:rPr>
-        <w:t xml:space="preserve">TVP</w:t>
-      </w:r>
-      <w:r>
-        <w:t xml:space="preserve"> </w:t>
-      </w:r>
-      <w:r>
-        <w:t xml:space="preserve">(verde) y píldora</w:t>
-      </w:r>
-      <w:r>
-        <w:t xml:space="preserve"> </w:t>
-      </w:r>
-      <w:r>
-        <w:rPr>
-          <w:b/>
-        </w:rPr>
-        <w:t xml:space="preserve">CMV/TVP %</w:t>
-      </w:r>
-      <w:r>
-        <w:t xml:space="preserve">. Exporta a Excel (Contabilidad).</w:t>
+        <w:t xml:space="preserve">Proyección</w:t>
+      </w:r>
+      <w:r>
+        <w:t xml:space="preserve"> </w:t>
+      </w:r>
+      <w:r>
+        <w:t xml:space="preserve">— Por GA/categoría/código y por mes: VA c/stk, %, V.P. u, CMV, CMV/Vta, Venta $-USD + tendencia. Encabezado: TC editable, CMV/TVP y % en pesos. Ventana de 4 meses. Excel.</w:t>
       </w:r>
     </w:p>
     <w:p>
@@ -404,48 +296,18 @@
         <w:t xml:space="preserve"> </w:t>
       </w:r>
       <w:r>
-        <w:t xml:space="preserve">— Precisión del forecast: por cada mes archivado, VP proyectada de ese mes vs venta real. Matriz meses × filas (VP / Real / Desv%) con</w:t>
-      </w:r>
-      <w:r>
-        <w:t xml:space="preserve"> </w:t>
-      </w:r>
-      <w:r>
-        <w:rPr>
-          <w:b/>
-        </w:rPr>
-        <w:t xml:space="preserve">Precisión general</w:t>
-      </w:r>
-      <w:r>
-        <w:t xml:space="preserve">.</w:t>
+        <w:t xml:space="preserve">— Precisión del forecast: por mes, V.P. u / % / V.R. u / V.P. $-USD / % / V.R. $-USD. Ventana de 4 meses.</w:t>
       </w:r>
     </w:p>
     <w:p>
       <w:pPr>
         <w:pStyle w:val="Heading3"/>
       </w:pPr>
-      <w:bookmarkStart w:id="25" w:name="filtros-globales-en-cascada"/>
-      <w:r>
-        <w:t xml:space="preserve">Filtros globales (en cascada)</w:t>
+      <w:bookmarkStart w:id="25" w:name="lógica-clave"/>
+      <w:r>
+        <w:t xml:space="preserve">Lógica clave</w:t>
       </w:r>
       <w:bookmarkEnd w:id="25"/>
-    </w:p>
-    <w:p>
-      <w:pPr>
-        <w:pStyle w:val="FirstParagraph"/>
-      </w:pPr>
-      <w:r>
-        <w:t xml:space="preserve">Unidad de negocio → GA → Categoría → Código. Se aplican una vez arriba y valen para las 4 pestañas. Al elegir un código se autocompletan UN, GA y Categoría.</w:t>
-      </w:r>
-    </w:p>
-    <w:p>
-      <w:pPr>
-        <w:pStyle w:val="Heading3"/>
-      </w:pPr>
-      <w:bookmarkStart w:id="26" w:name="lógica-clave-cómo-se-calcula"/>
-      <w:r>
-        <w:t xml:space="preserve">Lógica clave (cómo se calcula)</w:t>
-      </w:r>
-      <w:bookmarkEnd w:id="26"/>
     </w:p>
     <w:p>
       <w:pPr>
@@ -459,28 +321,13 @@
         <w:rPr>
           <w:b/>
         </w:rPr>
-        <w:t xml:space="preserve">Compra</w:t>
-      </w:r>
-      <w:r>
-        <w:t xml:space="preserve"> </w:t>
-      </w:r>
-      <w:r>
-        <w:t xml:space="preserve">=</w:t>
-      </w:r>
-      <w:r>
-        <w:t xml:space="preserve"> </w:t>
-      </w:r>
-      <w:r>
-        <w:t xml:space="preserve">“</w:t>
-      </w:r>
-      <w:r>
-        <w:t xml:space="preserve">Cantidad confirmada</w:t>
-      </w:r>
-      <w:r>
-        <w:t xml:space="preserve">”</w:t>
-      </w:r>
-      <w:r>
-        <w:t xml:space="preserve">. Stock final de un mes = stock inicio del siguiente. Semáforo de meses: rojo si meses &lt; (Meses/Cat − 2).</w:t>
+        <w:t xml:space="preserve">Exceso (método B):</w:t>
+      </w:r>
+      <w:r>
+        <w:t xml:space="preserve"> </w:t>
+      </w:r>
+      <w:r>
+        <w:t xml:space="preserve">Exceso unid. = Stock − suma de la V.P. de los meses del Ideal; el factor ×N extiende el horizonte (ideal×N meses); sólo exceso &gt; 0.</w:t>
       </w:r>
     </w:p>
     <w:p>
@@ -495,46 +342,28 @@
         <w:rPr>
           <w:b/>
         </w:rPr>
-        <w:t xml:space="preserve">Liquidación (método B):</w:t>
-      </w:r>
-      <w:r>
-        <w:t xml:space="preserve"> </w:t>
-      </w:r>
-      <w:r>
-        <w:t xml:space="preserve">Ideal en unidades = suma de la V.P. de los meses del</w:t>
-      </w:r>
-      <w:r>
-        <w:t xml:space="preserve"> </w:t>
-      </w:r>
-      <w:r>
-        <w:t xml:space="preserve">“</w:t>
-      </w:r>
-      <w:r>
-        <w:t xml:space="preserve">Ideal</w:t>
-      </w:r>
-      <w:r>
-        <w:t xml:space="preserve">”</w:t>
-      </w:r>
-      <w:r>
-        <w:t xml:space="preserve"> </w:t>
-      </w:r>
-      <w:r>
-        <w:t xml:space="preserve">(ej. 3 meses = VP de esos 3 meses).</w:t>
-      </w:r>
-      <w:r>
-        <w:t xml:space="preserve"> </w:t>
-      </w:r>
-      <w:r>
-        <w:rPr>
-          <w:b/>
-        </w:rPr>
-        <w:t xml:space="preserve">Exceso unid. = Stock − ese ideal.</w:t>
-      </w:r>
-      <w:r>
-        <w:t xml:space="preserve"> </w:t>
-      </w:r>
-      <w:r>
-        <w:t xml:space="preserve">El factor ×1.5/×2/×3 extiende el horizonte (ideal × factor meses). Sólo se listan códigos con exceso &gt; 0.</w:t>
+        <w:t xml:space="preserve">CMM</w:t>
+      </w:r>
+      <w:r>
+        <w:t xml:space="preserve"> </w:t>
+      </w:r>
+      <w:r>
+        <w:t xml:space="preserve">= (Lista1×0,7×0,93 − Costo) / (Lista1×0,7).</w:t>
+      </w:r>
+      <w:r>
+        <w:t xml:space="preserve"> </w:t>
+      </w:r>
+      <w:r>
+        <w:rPr>
+          <w:b/>
+        </w:rPr>
+        <w:t xml:space="preserve">CMM Liq.</w:t>
+      </w:r>
+      <w:r>
+        <w:t xml:space="preserve"> </w:t>
+      </w:r>
+      <w:r>
+        <w:t xml:space="preserve">= igual con Dto Liq: (Lista1×(1−DtoLiq)×0,7×0,93 − Costo)/(Lista1×(1−DtoLiq)×0,7). Dto Máx = mayor dto con contribución ≥ mín (def 10%); Dto Liq = Máx − gap (def 5%).</w:t>
       </w:r>
     </w:p>
     <w:p>
@@ -549,58 +378,43 @@
         <w:rPr>
           <w:b/>
         </w:rPr>
-        <w:t xml:space="preserve">Contribución(d)</w:t>
-      </w:r>
-      <w:r>
-        <w:t xml:space="preserve"> </w:t>
-      </w:r>
-      <w:r>
-        <w:t xml:space="preserve">= (Lista×(1−d)×0,7×0,93 − Costo) / (Lista×(1−d)×0,7).</w:t>
-      </w:r>
-      <w:r>
-        <w:t xml:space="preserve"> </w:t>
-      </w:r>
-      <w:r>
-        <w:rPr>
-          <w:b/>
-        </w:rPr>
-        <w:t xml:space="preserve">Dto. Máximo</w:t>
-      </w:r>
-      <w:r>
-        <w:t xml:space="preserve"> </w:t>
-      </w:r>
-      <w:r>
-        <w:t xml:space="preserve">= mayor descuento con contribución ≥ mínimo (def. 10%).</w:t>
-      </w:r>
-      <w:r>
-        <w:t xml:space="preserve"> </w:t>
-      </w:r>
-      <w:r>
-        <w:rPr>
-          <w:b/>
-        </w:rPr>
-        <w:t xml:space="preserve">Dto. Liq.</w:t>
-      </w:r>
-      <w:r>
-        <w:t xml:space="preserve"> </w:t>
-      </w:r>
-      <w:r>
-        <w:t xml:space="preserve">= Máximo − gap (def. 5%).</w:t>
-      </w:r>
-      <w:r>
-        <w:t xml:space="preserve"> </w:t>
-      </w:r>
-      <w:r>
-        <w:rPr>
-          <w:b/>
-        </w:rPr>
-        <w:t xml:space="preserve">PV mínimo</w:t>
-      </w:r>
-      <w:r>
-        <w:t xml:space="preserve"> </w:t>
-      </w:r>
-      <w:r>
-        <w:t xml:space="preserve">= Lista×0,7×(1−Dto.Máx).</w:t>
+        <w:t xml:space="preserve">Lista Base</w:t>
+      </w:r>
+      <w:r>
+        <w:t xml:space="preserve"> </w:t>
+      </w:r>
+      <w:r>
+        <w:t xml:space="preserve">= Lista 1 (J).</w:t>
+      </w:r>
+      <w:r>
+        <w:t xml:space="preserve"> </w:t>
+      </w:r>
+      <w:r>
+        <w:rPr>
+          <w:b/>
+        </w:rPr>
+        <w:t xml:space="preserve">Lista Mix</w:t>
+      </w:r>
+      <w:r>
+        <w:t xml:space="preserve"> </w:t>
+      </w:r>
+      <w:r>
+        <w:t xml:space="preserve">= precio ponderado (Forecast AS).</w:t>
+      </w:r>
+      <w:r>
+        <w:t xml:space="preserve"> </w:t>
+      </w:r>
+      <w:r>
+        <w:rPr>
+          <w:b/>
+        </w:rPr>
+        <w:t xml:space="preserve">Lista Dto. Máx.</w:t>
+      </w:r>
+      <w:r>
+        <w:t xml:space="preserve"> </w:t>
+      </w:r>
+      <w:r>
+        <w:t xml:space="preserve">= Lista1×0,7×(1−DtoMáx) (PV mínimo).</w:t>
       </w:r>
     </w:p>
     <w:p>
@@ -615,55 +429,43 @@
         <w:rPr>
           <w:b/>
         </w:rPr>
-        <w:t xml:space="preserve">Precio ponderado</w:t>
-      </w:r>
-      <w:r>
-        <w:t xml:space="preserve"> </w:t>
-      </w:r>
-      <w:r>
-        <w:t xml:space="preserve">= Forecast col</w:t>
-      </w:r>
-      <w:r>
-        <w:t xml:space="preserve"> </w:t>
-      </w:r>
-      <w:r>
-        <w:rPr>
-          <w:b/>
-        </w:rPr>
-        <w:t xml:space="preserve">AS</w:t>
-      </w:r>
-      <w:r>
-        <w:t xml:space="preserve">.</w:t>
-      </w:r>
-      <w:r>
-        <w:t xml:space="preserve"> </w:t>
-      </w:r>
-      <w:r>
-        <w:rPr>
-          <w:b/>
-        </w:rPr>
         <w:t xml:space="preserve">Costo total</w:t>
       </w:r>
       <w:r>
         <w:t xml:space="preserve"> </w:t>
       </w:r>
       <w:r>
-        <w:t xml:space="preserve">= Costo × Stock.</w:t>
-      </w:r>
-      <w:r>
-        <w:t xml:space="preserve"> </w:t>
-      </w:r>
-      <w:r>
-        <w:rPr>
-          <w:b/>
-        </w:rPr>
-        <w:t xml:space="preserve">Ponderado total</w:t>
-      </w:r>
-      <w:r>
-        <w:t xml:space="preserve"> </w:t>
-      </w:r>
-      <w:r>
-        <w:t xml:space="preserve">= Precio ponderado × Stock.</w:t>
+        <w:t xml:space="preserve">= Costo × Exceso U.</w:t>
+      </w:r>
+      <w:r>
+        <w:t xml:space="preserve"> </w:t>
+      </w:r>
+      <w:r>
+        <w:rPr>
+          <w:b/>
+        </w:rPr>
+        <w:t xml:space="preserve">Mix total</w:t>
+      </w:r>
+      <w:r>
+        <w:t xml:space="preserve"> </w:t>
+      </w:r>
+      <w:r>
+        <w:t xml:space="preserve">= Lista Mix × Exceso U.</w:t>
+      </w:r>
+      <w:r>
+        <w:t xml:space="preserve"> </w:t>
+      </w:r>
+      <w:r>
+        <w:rPr>
+          <w:b/>
+        </w:rPr>
+        <w:t xml:space="preserve">Mix total Liq. (Obj. Liq.)</w:t>
+      </w:r>
+      <w:r>
+        <w:t xml:space="preserve"> </w:t>
+      </w:r>
+      <w:r>
+        <w:t xml:space="preserve">= Lista Mix × (1−Dto Liq) × Exceso U.</w:t>
       </w:r>
     </w:p>
     <w:p>
@@ -678,22 +480,13 @@
         <w:rPr>
           <w:b/>
         </w:rPr>
-        <w:t xml:space="preserve">Proyección VP:</w:t>
-      </w:r>
-      <w:r>
-        <w:t xml:space="preserve"> </w:t>
-      </w:r>
-      <w:r>
-        <w:rPr>
-          <w:b/>
-        </w:rPr>
-        <w:t xml:space="preserve">VA c/stk</w:t>
-      </w:r>
-      <w:r>
-        <w:t xml:space="preserve"> </w:t>
-      </w:r>
-      <w:r>
-        <w:t xml:space="preserve">= valor de la columna</w:t>
+        <w:t xml:space="preserve">Proyección:</w:t>
+      </w:r>
+      <w:r>
+        <w:t xml:space="preserve"> </w:t>
+      </w:r>
+      <w:r>
+        <w:t xml:space="preserve">VA c/stk = valor tal cual de</w:t>
       </w:r>
       <w:r>
         <w:t xml:space="preserve"> </w:t>
@@ -711,118 +504,7 @@
         <w:t xml:space="preserve"> </w:t>
       </w:r>
       <w:r>
-        <w:t xml:space="preserve">del Forecast, tal cual (ya no se multiplica por estacionalidad). El</w:t>
-      </w:r>
-      <w:r>
-        <w:t xml:space="preserve"> </w:t>
-      </w:r>
-      <w:r>
-        <w:t xml:space="preserve">“</w:t>
-      </w:r>
-      <w:r>
-        <w:t xml:space="preserve">%</w:t>
-      </w:r>
-      <w:r>
-        <w:t xml:space="preserve">”</w:t>
-      </w:r>
-      <w:r>
-        <w:t xml:space="preserve"> </w:t>
-      </w:r>
-      <w:r>
-        <w:t xml:space="preserve">compara VA c/stk vs V.P. u (muestra</w:t>
-      </w:r>
-      <w:r>
-        <w:t xml:space="preserve"> </w:t>
-      </w:r>
-      <w:r>
-        <w:t xml:space="preserve">“</w:t>
-      </w:r>
-      <w:r>
-        <w:t xml:space="preserve">–</w:t>
-      </w:r>
-      <w:r>
-        <w:t xml:space="preserve">”</w:t>
-      </w:r>
-      <w:r>
-        <w:t xml:space="preserve"> </w:t>
-      </w:r>
-      <w:r>
-        <w:t xml:space="preserve">si son iguales).</w:t>
-      </w:r>
-      <w:r>
-        <w:t xml:space="preserve"> </w:t>
-      </w:r>
-      <w:r>
-        <w:rPr>
-          <w:b/>
-        </w:rPr>
-        <w:t xml:space="preserve">CMV</w:t>
-      </w:r>
-      <w:r>
-        <w:t xml:space="preserve"> </w:t>
-      </w:r>
-      <w:r>
-        <w:t xml:space="preserve">= Costo × V.P. u.</w:t>
-      </w:r>
-      <w:r>
-        <w:t xml:space="preserve"> </w:t>
-      </w:r>
-      <w:r>
-        <w:rPr>
-          <w:b/>
-        </w:rPr>
-        <w:t xml:space="preserve">CMV/Vta</w:t>
-      </w:r>
-      <w:r>
-        <w:t xml:space="preserve"> </w:t>
-      </w:r>
-      <w:r>
-        <w:t xml:space="preserve">= CMV / Venta. Totales del encabezado en pesos:</w:t>
-      </w:r>
-      <w:r>
-        <w:t xml:space="preserve"> </w:t>
-      </w:r>
-      <w:r>
-        <w:rPr>
-          <w:b/>
-        </w:rPr>
-        <w:t xml:space="preserve">CMV</w:t>
-      </w:r>
-      <w:r>
-        <w:t xml:space="preserve"> </w:t>
-      </w:r>
-      <w:r>
-        <w:t xml:space="preserve">= (CMV importados × TC) + (CMV distribución);</w:t>
-      </w:r>
-      <w:r>
-        <w:t xml:space="preserve"> </w:t>
-      </w:r>
-      <w:r>
-        <w:rPr>
-          <w:b/>
-        </w:rPr>
-        <w:t xml:space="preserve">TVP</w:t>
-      </w:r>
-      <w:r>
-        <w:t xml:space="preserve"> </w:t>
-      </w:r>
-      <w:r>
-        <w:t xml:space="preserve">ídem con la venta;</w:t>
-      </w:r>
-      <w:r>
-        <w:t xml:space="preserve"> </w:t>
-      </w:r>
-      <w:r>
-        <w:rPr>
-          <w:b/>
-        </w:rPr>
-        <w:t xml:space="preserve">CMV/TVP %</w:t>
-      </w:r>
-      <w:r>
-        <w:t xml:space="preserve"> </w:t>
-      </w:r>
-      <w:r>
-        <w:t xml:space="preserve">= CMV/TVP. Tendencia mensual = col AN; anual = (1+mensual)^12 − 1.</w:t>
+        <w:t xml:space="preserve">(sin ×estacionalidad). CMV = Costo × V.P. u. Venta $-USD = venta proy. USD. CMV/Vta = CMV/Venta.</w:t>
       </w:r>
     </w:p>
     <w:p>
@@ -843,7 +525,7 @@
         <w:t xml:space="preserve"> </w:t>
       </w:r>
       <w:r>
-        <w:t xml:space="preserve">por cada</w:t>
+        <w:t xml:space="preserve">V.P. del mes = CJ+1 del archivo</w:t>
       </w:r>
       <w:r>
         <w:t xml:space="preserve"> </w:t>
@@ -858,78 +540,18 @@
         <w:t xml:space="preserve">”</w:t>
       </w:r>
       <w:r>
-        <w:t xml:space="preserve">, VP del mes =</w:t>
-      </w:r>
-      <w:r>
-        <w:t xml:space="preserve"> </w:t>
-      </w:r>
-      <w:r>
-        <w:rPr>
-          <w:b/>
-        </w:rPr>
-        <w:t xml:space="preserve">CJ+1</w:t>
-      </w:r>
-      <w:r>
-        <w:t xml:space="preserve"> </w:t>
-      </w:r>
-      <w:r>
-        <w:t xml:space="preserve">(venta proy. unidades del primer bloque). Venta real = columnas</w:t>
-      </w:r>
-      <w:r>
-        <w:t xml:space="preserve"> </w:t>
-      </w:r>
-      <w:r>
-        <w:rPr>
-          <w:b/>
-        </w:rPr>
-        <w:t xml:space="preserve">AB–AM</w:t>
-      </w:r>
-      <w:r>
-        <w:t xml:space="preserve"> </w:t>
-      </w:r>
-      <w:r>
-        <w:t xml:space="preserve">del Forecast vivo, en valor absoluto (SAP las baja negativas); los meses se mapean por los rótulos de la fila 3. Match por código.</w:t>
-      </w:r>
-      <w:r>
-        <w:t xml:space="preserve"> </w:t>
-      </w:r>
-      <w:r>
-        <w:rPr>
-          <w:b/>
-        </w:rPr>
-        <w:t xml:space="preserve">Desv%</w:t>
-      </w:r>
-      <w:r>
-        <w:t xml:space="preserve"> </w:t>
-      </w:r>
-      <w:r>
-        <w:t xml:space="preserve">= (Real − VP) / VP.</w:t>
-      </w:r>
-      <w:r>
-        <w:t xml:space="preserve"> </w:t>
-      </w:r>
-      <w:r>
-        <w:rPr>
-          <w:b/>
-        </w:rPr>
-        <w:t xml:space="preserve">Precisión general</w:t>
-      </w:r>
-      <w:r>
-        <w:t xml:space="preserve"> </w:t>
-      </w:r>
-      <w:r>
-        <w:t xml:space="preserve">= 100 − Σ|Real−VP| / ΣVP.</w:t>
+        <w:t xml:space="preserve">. V.R. u = AB–AM del vivo (abs). V.P. $-USD = MIX × V.P. u. V.R. $-USD = venta real facturada (archivo Venta_real). % = (real − proy)/proy.</w:t>
       </w:r>
     </w:p>
     <w:p>
       <w:pPr>
         <w:pStyle w:val="Heading3"/>
       </w:pPr>
-      <w:bookmarkStart w:id="27" w:name="datos-y-formato"/>
-      <w:r>
-        <w:t xml:space="preserve">Datos y formato</w:t>
-      </w:r>
-      <w:bookmarkEnd w:id="27"/>
+      <w:bookmarkStart w:id="26" w:name="estética-formato"/>
+      <w:r>
+        <w:t xml:space="preserve">Estética / formato</w:t>
+      </w:r>
+      <w:bookmarkEnd w:id="26"/>
     </w:p>
     <w:p>
       <w:pPr>
@@ -940,19 +562,22 @@
         <w:pStyle w:val="Compact"/>
       </w:pPr>
       <w:r>
-        <w:t xml:space="preserve">El generador</w:t>
-      </w:r>
-      <w:r>
-        <w:t xml:space="preserve"> </w:t>
-      </w:r>
-      <w:r>
-        <w:rPr>
-          <w:b/>
-        </w:rPr>
-        <w:t xml:space="preserve">no pre-redondea</w:t>
-      </w:r>
-      <w:r>
-        <w:t xml:space="preserve">: guarda los valores con la precisión de Excel (los totales coinciden con la planilla).</w:t>
+        <w:t xml:space="preserve">Todas las tablas: encabezado azul, letra blanca,</w:t>
+      </w:r>
+      <w:r>
+        <w:t xml:space="preserve"> </w:t>
+      </w:r>
+      <w:r>
+        <w:rPr>
+          <w:b/>
+        </w:rPr>
+        <w:t xml:space="preserve">línea amarilla como corte</w:t>
+      </w:r>
+      <w:r>
+        <w:t xml:space="preserve"> </w:t>
+      </w:r>
+      <w:r>
+        <w:t xml:space="preserve">entre encabezado y datos (el segmento Liquidación va invertido: amarillo con letra azul).</w:t>
       </w:r>
     </w:p>
     <w:p>
@@ -964,7 +589,40 @@
         <w:pStyle w:val="Compact"/>
       </w:pPr>
       <w:r>
-        <w:t xml:space="preserve">Los Excel descargables (Liquidación y Proyección VP) usan</w:t>
+        <w:rPr>
+          <w:b/>
+        </w:rPr>
+        <w:t xml:space="preserve">Totales:</w:t>
+      </w:r>
+      <w:r>
+        <w:t xml:space="preserve"> </w:t>
+      </w:r>
+      <w:r>
+        <w:t xml:space="preserve">gris claro, letra negra, importes con su color (Costo rojo, Mix/Obj verde).</w:t>
+      </w:r>
+    </w:p>
+    <w:p>
+      <w:pPr>
+        <w:numPr>
+          <w:ilvl w:val="0"/>
+          <w:numId w:val="1004"/>
+        </w:numPr>
+        <w:pStyle w:val="Compact"/>
+      </w:pPr>
+      <w:r>
+        <w:t xml:space="preserve">Excels (Liquidación y Proyección):</w:t>
+      </w:r>
+      <w:r>
+        <w:t xml:space="preserve"> </w:t>
+      </w:r>
+      <w:r>
+        <w:rPr>
+          <w:b/>
+        </w:rPr>
+        <w:t xml:space="preserve">mismo formato que el preview</w:t>
+      </w:r>
+      <w:r>
+        <w:t xml:space="preserve">, con números en</w:t>
       </w:r>
       <w:r>
         <w:t xml:space="preserve"> </w:t>
@@ -976,81 +634,45 @@
         <w:t xml:space="preserve">formato Contabilidad USD / $</w:t>
       </w:r>
       <w:r>
-        <w:t xml:space="preserve">, como número (se pueden sumar sin convertir).</w:t>
+        <w:t xml:space="preserve"> </w:t>
+      </w:r>
+      <w:r>
+        <w:t xml:space="preserve">(numérico, se pueden sumar).</w:t>
+      </w:r>
+    </w:p>
+    <w:p>
+      <w:pPr>
+        <w:numPr>
+          <w:ilvl w:val="0"/>
+          <w:numId w:val="1004"/>
+        </w:numPr>
+        <w:pStyle w:val="Compact"/>
+      </w:pPr>
+      <w:r>
+        <w:t xml:space="preserve">El generador</w:t>
+      </w:r>
+      <w:r>
+        <w:t xml:space="preserve"> </w:t>
+      </w:r>
+      <w:r>
+        <w:rPr>
+          <w:b/>
+        </w:rPr>
+        <w:t xml:space="preserve">no pre-redondea</w:t>
+      </w:r>
+      <w:r>
+        <w:t xml:space="preserve">: los valores coinciden con Excel.</w:t>
       </w:r>
     </w:p>
     <w:p>
       <w:pPr>
         <w:pStyle w:val="Heading3"/>
       </w:pPr>
-      <w:bookmarkStart w:id="28" w:name="rendimiento-cache-histórico"/>
-      <w:r>
-        <w:t xml:space="preserve">Rendimiento (cache Histórico)</w:t>
-      </w:r>
-      <w:bookmarkEnd w:id="28"/>
-    </w:p>
-    <w:p>
-      <w:pPr>
-        <w:pStyle w:val="FirstParagraph"/>
-      </w:pPr>
-      <w:r>
-        <w:t xml:space="preserve">Los</w:t>
-      </w:r>
-      <w:r>
-        <w:t xml:space="preserve"> </w:t>
-      </w:r>
-      <w:r>
-        <w:t xml:space="preserve">“</w:t>
-      </w:r>
-      <w:r>
-        <w:t xml:space="preserve">Forecast MM-AA</w:t>
-      </w:r>
-      <w:r>
-        <w:t xml:space="preserve">”</w:t>
-      </w:r>
-      <w:r>
-        <w:t xml:space="preserve"> </w:t>
-      </w:r>
-      <w:r>
-        <w:t xml:space="preserve">son archivos congelados. El generador los abre</w:t>
-      </w:r>
-      <w:r>
-        <w:t xml:space="preserve"> </w:t>
-      </w:r>
-      <w:r>
-        <w:rPr>
-          <w:b/>
-        </w:rPr>
-        <w:t xml:space="preserve">una sola vez</w:t>
-      </w:r>
-      <w:r>
-        <w:t xml:space="preserve"> </w:t>
-      </w:r>
-      <w:r>
-        <w:t xml:space="preserve">y guarda las proyecciones en</w:t>
-      </w:r>
-      <w:r>
-        <w:t xml:space="preserve"> </w:t>
-      </w:r>
-      <w:r>
-        <w:rPr>
-          <w:rStyle w:val="VerbatimChar"/>
-        </w:rPr>
-        <w:t xml:space="preserve">generador/historico_vp.json</w:t>
-      </w:r>
-      <w:r>
-        <w:t xml:space="preserve">. Las corridas siguientes no vuelven a abrir esos pesados → siguen siendo rápidas. Un mes nuevo se detecta y se agrega solo.</w:t>
-      </w:r>
-    </w:p>
-    <w:p>
-      <w:pPr>
-        <w:pStyle w:val="Heading3"/>
-      </w:pPr>
-      <w:bookmarkStart w:id="29" w:name="Xc3c14c7c15e71b4537cb0ea4686a7e73775dc32"/>
-      <w:r>
-        <w:t xml:space="preserve">Estructura de los Excel (referencia técnica)</w:t>
-      </w:r>
-      <w:bookmarkEnd w:id="29"/>
+      <w:bookmarkStart w:id="27" w:name="rendimiento"/>
+      <w:r>
+        <w:t xml:space="preserve">Rendimiento</w:t>
+      </w:r>
+      <w:bookmarkEnd w:id="27"/>
     </w:p>
     <w:p>
       <w:pPr>
@@ -1064,37 +686,40 @@
         <w:rPr>
           <w:b/>
         </w:rPr>
-        <w:t xml:space="preserve">Forecast</w:t>
-      </w:r>
-      <w:r>
-        <w:t xml:space="preserve"> </w:t>
-      </w:r>
-      <w:r>
-        <w:t xml:space="preserve">(hoja</w:t>
-      </w:r>
-      <w:r>
-        <w:t xml:space="preserve"> </w:t>
-      </w:r>
-      <w:r>
-        <w:rPr>
-          <w:i/>
-        </w:rPr>
-        <w:t xml:space="preserve">Forecast</w:t>
-      </w:r>
-      <w:r>
-        <w:t xml:space="preserve">): fila 3 = encabezados, datos por código desde la fila 6. Bloques mensuales stride 14 desde col</w:t>
-      </w:r>
-      <w:r>
-        <w:t xml:space="preserve"> </w:t>
-      </w:r>
-      <w:r>
-        <w:rPr>
-          <w:b/>
-        </w:rPr>
-        <w:t xml:space="preserve">CJ</w:t>
-      </w:r>
-      <w:r>
-        <w:t xml:space="preserve">: V.P. unidades = CJ+1. Identidad: UN=A, GA=B, Código=C, Categoría=F, Meses/Cat=H, Stock=BN, Meses=BO, Tendencia=AN, Precio ponderado=AS. Estacionalidad/Evento/TC por mes en la fila 2 del bloque. Venta real por mes en AB–AM. Cada GA tiene 2 filas de encabezado con su banner IMPO.</w:t>
+        <w:t xml:space="preserve">Cache Histórico</w:t>
+      </w:r>
+      <w:r>
+        <w:t xml:space="preserve"> </w:t>
+      </w:r>
+      <w:r>
+        <w:t xml:space="preserve">(</w:t>
+      </w:r>
+      <w:r>
+        <w:rPr>
+          <w:rStyle w:val="VerbatimChar"/>
+        </w:rPr>
+        <w:t xml:space="preserve">generador/historico_vp.json</w:t>
+      </w:r>
+      <w:r>
+        <w:t xml:space="preserve">): los</w:t>
+      </w:r>
+      <w:r>
+        <w:t xml:space="preserve"> </w:t>
+      </w:r>
+      <w:r>
+        <w:t xml:space="preserve">“</w:t>
+      </w:r>
+      <w:r>
+        <w:t xml:space="preserve">Forecast MM-AA</w:t>
+      </w:r>
+      <w:r>
+        <w:t xml:space="preserve">”</w:t>
+      </w:r>
+      <w:r>
+        <w:t xml:space="preserve"> </w:t>
+      </w:r>
+      <w:r>
+        <w:t xml:space="preserve">se abren 1 sola vez (VP + MIX). Un mes nuevo se detecta y se agrega solo.</w:t>
       </w:r>
     </w:p>
     <w:p>
@@ -1107,38 +732,26 @@
       </w:pPr>
       <w:r>
         <w:rPr>
-          <w:b/>
-        </w:rPr>
-        <w:t xml:space="preserve">Costos</w:t>
-      </w:r>
-      <w:r>
-        <w:t xml:space="preserve"> </w:t>
-      </w:r>
-      <w:r>
-        <w:t xml:space="preserve">(hoja</w:t>
-      </w:r>
-      <w:r>
-        <w:t xml:space="preserve"> </w:t>
-      </w:r>
-      <w:r>
-        <w:rPr>
-          <w:i/>
-        </w:rPr>
-        <w:t xml:space="preserve">General</w:t>
-      </w:r>
-      <w:r>
-        <w:t xml:space="preserve">): Costo=AC, Lista actual=J, Moneda=I, CMM=F.</w:t>
+          <w:rStyle w:val="VerbatimChar"/>
+        </w:rPr>
+        <w:t xml:space="preserve">visibleRows</w:t>
+      </w:r>
+      <w:r>
+        <w:t xml:space="preserve"> </w:t>
+      </w:r>
+      <w:r>
+        <w:t xml:space="preserve">memoizado; debounce en filtros; cacheo por pestaña; ventana de 4 meses por vista.</w:t>
       </w:r>
     </w:p>
     <w:p>
       <w:pPr>
         <w:pStyle w:val="Heading3"/>
       </w:pPr>
-      <w:bookmarkStart w:id="30" w:name="cómo-actualizar"/>
+      <w:bookmarkStart w:id="28" w:name="cómo-actualizar"/>
       <w:r>
         <w:t xml:space="preserve">Cómo actualizar</w:t>
       </w:r>
-      <w:bookmarkEnd w:id="30"/>
+      <w:bookmarkEnd w:id="28"/>
     </w:p>
     <w:p>
       <w:pPr>
@@ -1149,7 +762,7 @@
         <w:pStyle w:val="Compact"/>
       </w:pPr>
       <w:r>
-        <w:t xml:space="preserve">Guardar Forecast.xlsm y Costos.xlsm actualizados en Drive/G:.</w:t>
+        <w:t xml:space="preserve">Guardar Forecast.xlsm, Costos.xlsm y Venta_real*.xlsx actualizados en la carpeta.</w:t>
       </w:r>
     </w:p>
     <w:p>
@@ -1173,7 +786,10 @@
         <w:t xml:space="preserve">Subir_a_GitHub.bat</w:t>
       </w:r>
       <w:r>
-        <w:t xml:space="preserve">: regenera con datos frescos y publica.</w:t>
+        <w:t xml:space="preserve"> </w:t>
+      </w:r>
+      <w:r>
+        <w:t xml:space="preserve">→ regenera y publica. (La 1ª vez que aparece un mes nuevo tarda unos minutos; después es rápido.) Requiere Python instalado.</w:t>
       </w:r>
     </w:p>
     <w:p>
@@ -1185,149 +801,25 @@
         <w:pStyle w:val="Compact"/>
       </w:pPr>
       <w:r>
-        <w:t xml:space="preserve">Abrir la URL (Ctrl+F5). El badge</w:t>
-      </w:r>
-      <w:r>
-        <w:t xml:space="preserve"> </w:t>
-      </w:r>
-      <w:r>
-        <w:t xml:space="preserve">“</w:t>
-      </w:r>
-      <w:r>
-        <w:t xml:space="preserve">Actualizado</w:t>
-      </w:r>
-      <w:r>
-        <w:t xml:space="preserve">”</w:t>
-      </w:r>
-      <w:r>
-        <w:t xml:space="preserve"> </w:t>
-      </w:r>
-      <w:r>
-        <w:t xml:space="preserve">confirma fecha/hora.</w:t>
-      </w:r>
-      <w:r>
-        <w:t xml:space="preserve"> </w:t>
-      </w:r>
-      <w:r>
-        <w:t xml:space="preserve">&gt; La primera vez que aparece un mes nuevo, la corrida tarda unos minutos más (arma el cache del Histórico). Requiere Python instalado en la PC.</w:t>
+        <w:t xml:space="preserve">Ctrl+F5 en la URL.</w:t>
       </w:r>
     </w:p>
     <w:p>
       <w:pPr>
         <w:pStyle w:val="Heading3"/>
       </w:pPr>
-      <w:bookmarkStart w:id="31" w:name="archivos-del-proyecto"/>
-      <w:r>
-        <w:t xml:space="preserve">Archivos del proyecto</w:t>
-      </w:r>
-      <w:bookmarkEnd w:id="31"/>
-    </w:p>
-    <w:p>
-      <w:pPr>
-        <w:numPr>
-          <w:ilvl w:val="0"/>
-          <w:numId w:val="1007"/>
-        </w:numPr>
-        <w:pStyle w:val="Compact"/>
-      </w:pPr>
-      <w:r>
-        <w:rPr>
-          <w:b/>
-        </w:rPr>
-        <w:t xml:space="preserve">Dashboard_Forecast.html</w:t>
-      </w:r>
-      <w:r>
-        <w:t xml:space="preserve"> </w:t>
-      </w:r>
-      <w:r>
-        <w:t xml:space="preserve">— el tablero (generado).</w:t>
-      </w:r>
-    </w:p>
-    <w:p>
-      <w:pPr>
-        <w:numPr>
-          <w:ilvl w:val="0"/>
-          <w:numId w:val="1007"/>
-        </w:numPr>
-        <w:pStyle w:val="Compact"/>
-      </w:pPr>
-      <w:r>
-        <w:rPr>
-          <w:b/>
-        </w:rPr>
-        <w:t xml:space="preserve">Subir_a_GitHub.bat</w:t>
-      </w:r>
-      <w:r>
-        <w:t xml:space="preserve"> </w:t>
-      </w:r>
-      <w:r>
-        <w:t xml:space="preserve">— regenera y publica.</w:t>
-      </w:r>
-    </w:p>
-    <w:p>
-      <w:pPr>
-        <w:numPr>
-          <w:ilvl w:val="0"/>
-          <w:numId w:val="1007"/>
-        </w:numPr>
-        <w:pStyle w:val="Compact"/>
-      </w:pPr>
-      <w:r>
-        <w:rPr>
-          <w:b/>
-        </w:rPr>
-        <w:t xml:space="preserve">generador/</w:t>
-      </w:r>
-      <w:r>
-        <w:t xml:space="preserve"> </w:t>
-      </w:r>
-      <w:r>
-        <w:t xml:space="preserve">— plantilla.html, generar_dashboard.py, generar_liquidacion.py, Liquidacion_base.xlsm, historico_vp.json (cache).</w:t>
-      </w:r>
-    </w:p>
-    <w:p>
-      <w:pPr>
-        <w:numPr>
-          <w:ilvl w:val="0"/>
-          <w:numId w:val="1007"/>
-        </w:numPr>
-        <w:pStyle w:val="Compact"/>
-      </w:pPr>
-      <w:r>
-        <w:rPr>
-          <w:b/>
-        </w:rPr>
-        <w:t xml:space="preserve">Memoria/</w:t>
-      </w:r>
-      <w:r>
-        <w:t xml:space="preserve">,</w:t>
-      </w:r>
-      <w:r>
-        <w:t xml:space="preserve"> </w:t>
-      </w:r>
-      <w:r>
-        <w:rPr>
-          <w:b/>
-        </w:rPr>
-        <w:t xml:space="preserve">Prompt/</w:t>
-      </w:r>
-      <w:r>
-        <w:t xml:space="preserve">,</w:t>
-      </w:r>
-      <w:r>
-        <w:t xml:space="preserve"> </w:t>
-      </w:r>
-      <w:r>
-        <w:rPr>
-          <w:b/>
-        </w:rPr>
-        <w:t xml:space="preserve">Skills/</w:t>
-      </w:r>
-      <w:r>
-        <w:t xml:space="preserve"> </w:t>
-      </w:r>
-      <w:r>
-        <w:t xml:space="preserve">— documentación (PDF + Word).</w:t>
+      <w:bookmarkStart w:id="29" w:name="archivos"/>
+      <w:r>
+        <w:t xml:space="preserve">Archivos</w:t>
+      </w:r>
+      <w:bookmarkEnd w:id="29"/>
+    </w:p>
+    <w:p>
+      <w:pPr>
+        <w:pStyle w:val="FirstParagraph"/>
+      </w:pPr>
+      <w:r>
+        <w:t xml:space="preserve">Dashboard_Forecast.html · Subir_a_GitHub.bat · generador/ (plantilla.html, generar_dashboard.py, historico_vp.json) · Memoria/ Prompt/ Skills/.</w:t>
       </w:r>
     </w:p>
     <w:sectPr/>
@@ -1752,9 +1244,6 @@
     <w:lvlOverride w:ilvl="8">
       <w:startOverride w:val="1"/>
     </w:lvlOverride>
-  </w:num>
-  <w:num w:numId="1007">
-    <w:abstractNumId w:val="991"/>
   </w:num>
 </w:numbering>
 </file>

</xml_diff>

<commit_message>
Actualiza dashboard mié 22/07/2026 17:17:18,88
</commit_message>
<xml_diff>
--- a/Memoria/Memoria.docx
+++ b/Memoria/Memoria.docx
@@ -112,7 +112,7 @@
         <w:t xml:space="preserve">Forecast</w:t>
       </w:r>
       <w:r>
-        <w:t xml:space="preserve">): stock, ventas proyectadas, compras, IMPO, estacionalidad, tendencia, venta real (AB–AM), precio ponderado (MIX, col AS).</w:t>
+        <w:t xml:space="preserve">): stock, ventas proyectadas, compras, IMPO, estacionalidad, tendencia, venta real en unidades (AB–AM), precio ponderado (MIX, col AS).</w:t>
       </w:r>
     </w:p>
     <w:p>
@@ -145,22 +145,7 @@
         <w:t xml:space="preserve">General</w:t>
       </w:r>
       <w:r>
-        <w:t xml:space="preserve">): Costo=AC, Lista actual (Lista 1)=J, Moneda=I, Q=17 (lista nueva, uso futuro). La CMM ya</w:t>
-      </w:r>
-      <w:r>
-        <w:t xml:space="preserve"> </w:t>
-      </w:r>
-      <w:r>
-        <w:rPr>
-          <w:b/>
-        </w:rPr>
-        <w:t xml:space="preserve">no</w:t>
-      </w:r>
-      <w:r>
-        <w:t xml:space="preserve"> </w:t>
-      </w:r>
-      <w:r>
-        <w:t xml:space="preserve">se lee de Costos: la calcula el dashboard con Lista 1.</w:t>
+        <w:t xml:space="preserve">): Costo=AC, Lista actual (Lista 1)=J, Moneda=I, Q=17 (lista nueva, uso futuro). La CMM la calcula el dashboard con Lista 1.</w:t>
       </w:r>
     </w:p>
     <w:p>
@@ -181,7 +166,7 @@
         <w:t xml:space="preserve"> </w:t>
       </w:r>
       <w:r>
-        <w:t xml:space="preserve">(archivos mensuales congelados, misma carpeta): para el Histórico — VP del mes y precio MIX (se leen 1 vez y quedan en cache).</w:t>
+        <w:t xml:space="preserve">(archivos mensuales congelados): para el Histórico — VP del mes y precio MIX (se leen 1 vez y quedan en cache).</w:t>
       </w:r>
     </w:p>
     <w:p>
@@ -196,22 +181,37 @@
         <w:rPr>
           <w:b/>
         </w:rPr>
-        <w:t xml:space="preserve">Venta_real*.xlsx</w:t>
-      </w:r>
-      <w:r>
-        <w:t xml:space="preserve"> </w:t>
-      </w:r>
-      <w:r>
-        <w:t xml:space="preserve">(misma carpeta): venta real facturada por código y mes (USD), alimenta la V.R. $-USD del Histórico.</w:t>
+        <w:t xml:space="preserve">V.R. mensual.xlsx</w:t>
+      </w:r>
+      <w:r>
+        <w:t xml:space="preserve"> </w:t>
+      </w:r>
+      <w:r>
+        <w:t xml:space="preserve">(venta real facturada): por código y mes. Alimenta la columna</w:t>
+      </w:r>
+      <w:r>
+        <w:t xml:space="preserve"> </w:t>
+      </w:r>
+      <w:r>
+        <w:rPr>
+          <w:b/>
+        </w:rPr>
+        <w:t xml:space="preserve">V.R. $-USD</w:t>
+      </w:r>
+      <w:r>
+        <w:t xml:space="preserve"> </w:t>
+      </w:r>
+      <w:r>
+        <w:t xml:space="preserve">del Histórico. Ver detalle abajo.</w:t>
       </w:r>
     </w:p>
     <w:p>
       <w:pPr>
         <w:pStyle w:val="Heading3"/>
       </w:pPr>
-      <w:bookmarkStart w:id="24" w:name="Xb5c03af40887c7c77f6b9e85d6e722e7eca289c"/>
-      <w:r>
-        <w:t xml:space="preserve">Las 4 pestañas (con filtros globales UN→GA→Categoría→Código)</w:t>
+      <w:bookmarkStart w:id="24" w:name="archivo-de-venta-real-v.r.-mensual"/>
+      <w:r>
+        <w:t xml:space="preserve">Archivo de venta real (V.R. mensual)</w:t>
       </w:r>
       <w:bookmarkEnd w:id="24"/>
     </w:p>
@@ -224,16 +224,22 @@
         <w:pStyle w:val="Compact"/>
       </w:pPr>
       <w:r>
-        <w:rPr>
-          <w:b/>
-        </w:rPr>
-        <w:t xml:space="preserve">Forecast</w:t>
-      </w:r>
-      <w:r>
-        <w:t xml:space="preserve"> </w:t>
-      </w:r>
-      <w:r>
-        <w:t xml:space="preserve">— Tabla por código: stock, meses, y por mes stock inicio/meses/compra/VP/stock final/meses fin. Panel IMPO por mes. Ventana de 4 meses con flechas ◀▶.</w:t>
+        <w:t xml:space="preserve">Se arma desde</w:t>
+      </w:r>
+      <w:r>
+        <w:t xml:space="preserve"> </w:t>
+      </w:r>
+      <w:r>
+        <w:rPr>
+          <w:b/>
+        </w:rPr>
+        <w:t xml:space="preserve">Libro1.xlsx</w:t>
+      </w:r>
+      <w:r>
+        <w:t xml:space="preserve"> </w:t>
+      </w:r>
+      <w:r>
+        <w:t xml:space="preserve">(export de facturación de SAP, línea por línea). Columnas usadas: Fecha (G), Código (O), Grupo artículo (P), Cantidad (Q), Total S/Desc. (U), TC (W).</w:t>
       </w:r>
     </w:p>
     <w:p>
@@ -248,13 +254,43 @@
         <w:rPr>
           <w:b/>
         </w:rPr>
-        <w:t xml:space="preserve">Liquidación</w:t>
-      </w:r>
-      <w:r>
-        <w:t xml:space="preserve"> </w:t>
-      </w:r>
-      <w:r>
-        <w:t xml:space="preserve">— Candidatos con exceso positivo. Preview + Excel (idénticos). Segmentos: Producto (Grupo, Código, Cat., Ideal, VP, Costo, CMM, Lista Base, Lista Mix), Exceso stock (Stock U., Exceso U., Meses de stock, Exceso meses), Exceso $-USD (Costo total, Mix total), Liquidación (Dto. Máx., Lista Dto. Máx., Dto. Liq., Mix total Liq., CMM Liq.), Contribución marginal por % (colapsable). Totales arriba. 3 gráficos de excedente (unidades/costo/precio Mix) sobre el stock total filtrado. Ordenamiento por click (Costo total / Mix total / Exceso mes → mayor a menor; Código → limpiar).</w:t>
+        <w:t xml:space="preserve">Criterio de moneda (una sola columna $-USD):</w:t>
+      </w:r>
+      <w:r>
+        <w:t xml:space="preserve"> </w:t>
+      </w:r>
+      <w:r>
+        <w:t xml:space="preserve">si TC &gt; 0 (Importados) → valor en</w:t>
+      </w:r>
+      <w:r>
+        <w:t xml:space="preserve"> </w:t>
+      </w:r>
+      <w:r>
+        <w:rPr>
+          <w:b/>
+        </w:rPr>
+        <w:t xml:space="preserve">USD</w:t>
+      </w:r>
+      <w:r>
+        <w:t xml:space="preserve"> </w:t>
+      </w:r>
+      <w:r>
+        <w:t xml:space="preserve">= Total ÷ TC. Si TC = 0/vacío (Nacionales: Distribución, Complementario, Fabricación, Varios) → valor en</w:t>
+      </w:r>
+      <w:r>
+        <w:t xml:space="preserve"> </w:t>
+      </w:r>
+      <w:r>
+        <w:rPr>
+          <w:b/>
+        </w:rPr>
+        <w:t xml:space="preserve">pesos</w:t>
+      </w:r>
+      <w:r>
+        <w:t xml:space="preserve"> </w:t>
+      </w:r>
+      <w:r>
+        <w:t xml:space="preserve">= Total tal cual.</w:t>
       </w:r>
     </w:p>
     <w:p>
@@ -269,13 +305,64 @@
         <w:rPr>
           <w:b/>
         </w:rPr>
-        <w:t xml:space="preserve">Proyección</w:t>
-      </w:r>
-      <w:r>
-        <w:t xml:space="preserve"> </w:t>
-      </w:r>
-      <w:r>
-        <w:t xml:space="preserve">— Por GA/categoría/código y por mes: VA c/stk, %, V.P. u, CMV, CMV/Vta, Venta $-USD + tendencia. Encabezado: TC editable, CMV/TVP y % en pesos. Ventana de 4 meses. Excel.</w:t>
+        <w:t xml:space="preserve">Formato del archivo:</w:t>
+      </w:r>
+      <w:r>
+        <w:t xml:space="preserve"> </w:t>
+      </w:r>
+      <w:r>
+        <w:t xml:space="preserve">fila 1 =</w:t>
+      </w:r>
+      <w:r>
+        <w:t xml:space="preserve"> </w:t>
+      </w:r>
+      <w:r>
+        <w:t xml:space="preserve">“</w:t>
+      </w:r>
+      <w:r>
+        <w:t xml:space="preserve">Grupo artículo / Código / Cantidad tot. / VR $-USD</w:t>
+      </w:r>
+      <w:r>
+        <w:t xml:space="preserve">”</w:t>
+      </w:r>
+      <w:r>
+        <w:t xml:space="preserve"> </w:t>
+      </w:r>
+      <w:r>
+        <w:t xml:space="preserve">+ por mes el rótulo del mes; fila 2 =</w:t>
+      </w:r>
+      <w:r>
+        <w:t xml:space="preserve"> </w:t>
+      </w:r>
+      <w:r>
+        <w:t xml:space="preserve">“</w:t>
+      </w:r>
+      <w:r>
+        <w:t xml:space="preserve">Cant</w:t>
+      </w:r>
+      <w:r>
+        <w:t xml:space="preserve">”</w:t>
+      </w:r>
+      <w:r>
+        <w:t xml:space="preserve"> </w:t>
+      </w:r>
+      <w:r>
+        <w:t xml:space="preserve">/</w:t>
+      </w:r>
+      <w:r>
+        <w:t xml:space="preserve"> </w:t>
+      </w:r>
+      <w:r>
+        <w:t xml:space="preserve">“</w:t>
+      </w:r>
+      <w:r>
+        <w:t xml:space="preserve">$-USD</w:t>
+      </w:r>
+      <w:r>
+        <w:t xml:space="preserve">”</w:t>
+      </w:r>
+      <w:r>
+        <w:t xml:space="preserve">; datos desde la fila 3.</w:t>
       </w:r>
     </w:p>
     <w:p>
@@ -290,22 +377,127 @@
         <w:rPr>
           <w:b/>
         </w:rPr>
-        <w:t xml:space="preserve">Histórico</w:t>
-      </w:r>
-      <w:r>
-        <w:t xml:space="preserve"> </w:t>
-      </w:r>
-      <w:r>
-        <w:t xml:space="preserve">— Precisión del forecast: por mes, V.P. u / % / V.R. u / V.P. $-USD / % / V.R. $-USD. Ventana de 4 meses.</w:t>
+        <w:t xml:space="preserve">Nombre:</w:t>
+      </w:r>
+      <w:r>
+        <w:t xml:space="preserve"> </w:t>
+      </w:r>
+      <w:r>
+        <w:t xml:space="preserve">el generador detecta</w:t>
+      </w:r>
+      <w:r>
+        <w:t xml:space="preserve"> </w:t>
+      </w:r>
+      <w:r>
+        <w:rPr>
+          <w:rStyle w:val="VerbatimChar"/>
+        </w:rPr>
+        <w:t xml:space="preserve">Venta_real*</w:t>
+      </w:r>
+      <w:r>
+        <w:t xml:space="preserve">,</w:t>
+      </w:r>
+      <w:r>
+        <w:t xml:space="preserve"> </w:t>
+      </w:r>
+      <w:r>
+        <w:rPr>
+          <w:rStyle w:val="VerbatimChar"/>
+        </w:rPr>
+        <w:t xml:space="preserve">Venta real*</w:t>
+      </w:r>
+      <w:r>
+        <w:t xml:space="preserve">,</w:t>
+      </w:r>
+      <w:r>
+        <w:t xml:space="preserve"> </w:t>
+      </w:r>
+      <w:r>
+        <w:rPr>
+          <w:rStyle w:val="VerbatimChar"/>
+        </w:rPr>
+        <w:t xml:space="preserve">V.R*</w:t>
+      </w:r>
+      <w:r>
+        <w:t xml:space="preserve">,</w:t>
+      </w:r>
+      <w:r>
+        <w:t xml:space="preserve"> </w:t>
+      </w:r>
+      <w:r>
+        <w:rPr>
+          <w:rStyle w:val="VerbatimChar"/>
+        </w:rPr>
+        <w:t xml:space="preserve">VR *</w:t>
+      </w:r>
+      <w:r>
+        <w:t xml:space="preserve">,</w:t>
+      </w:r>
+      <w:r>
+        <w:t xml:space="preserve"> </w:t>
+      </w:r>
+      <w:r>
+        <w:rPr>
+          <w:rStyle w:val="VerbatimChar"/>
+        </w:rPr>
+        <w:t xml:space="preserve">V R *</w:t>
+      </w:r>
+      <w:r>
+        <w:t xml:space="preserve">. La subcolumna de valor se reconoce si su rótulo contiene</w:t>
+      </w:r>
+      <w:r>
+        <w:t xml:space="preserve"> </w:t>
+      </w:r>
+      <w:r>
+        <w:t xml:space="preserve">“</w:t>
+      </w:r>
+      <w:r>
+        <w:t xml:space="preserve">usd</w:t>
+      </w:r>
+      <w:r>
+        <w:t xml:space="preserve">”</w:t>
+      </w:r>
+      <w:r>
+        <w:t xml:space="preserve"> </w:t>
+      </w:r>
+      <w:r>
+        <w:t xml:space="preserve">(sirve</w:t>
+      </w:r>
+      <w:r>
+        <w:t xml:space="preserve"> </w:t>
+      </w:r>
+      <w:r>
+        <w:rPr>
+          <w:rStyle w:val="VerbatimChar"/>
+        </w:rPr>
+        <w:t xml:space="preserve">$-USD</w:t>
+      </w:r>
+      <w:r>
+        <w:t xml:space="preserve"> </w:t>
+      </w:r>
+      <w:r>
+        <w:t xml:space="preserve">o</w:t>
+      </w:r>
+      <w:r>
+        <w:t xml:space="preserve"> </w:t>
+      </w:r>
+      <w:r>
+        <w:rPr>
+          <w:rStyle w:val="VerbatimChar"/>
+        </w:rPr>
+        <w:t xml:space="preserve">USD</w:t>
+      </w:r>
+      <w:r>
+        <w:t xml:space="preserve">).</w:t>
       </w:r>
     </w:p>
     <w:p>
       <w:pPr>
         <w:pStyle w:val="Heading3"/>
       </w:pPr>
-      <w:bookmarkStart w:id="25" w:name="lógica-clave"/>
-      <w:r>
-        <w:t xml:space="preserve">Lógica clave</w:t>
+      <w:bookmarkStart w:id="25" w:name="Xb5c03af40887c7c77f6b9e85d6e722e7eca289c"/>
+      <w:r>
+        <w:t xml:space="preserve">Las 4 pestañas (con filtros globales UN→GA→Categoría→Código)</w:t>
       </w:r>
       <w:bookmarkEnd w:id="25"/>
     </w:p>
@@ -321,13 +513,13 @@
         <w:rPr>
           <w:b/>
         </w:rPr>
-        <w:t xml:space="preserve">Exceso (método B):</w:t>
-      </w:r>
-      <w:r>
-        <w:t xml:space="preserve"> </w:t>
-      </w:r>
-      <w:r>
-        <w:t xml:space="preserve">Exceso unid. = Stock − suma de la V.P. de los meses del Ideal; el factor ×N extiende el horizonte (ideal×N meses); sólo exceso &gt; 0.</w:t>
+        <w:t xml:space="preserve">Forecast</w:t>
+      </w:r>
+      <w:r>
+        <w:t xml:space="preserve"> </w:t>
+      </w:r>
+      <w:r>
+        <w:t xml:space="preserve">— Tabla por código: stock, meses, y por mes stock inicio/meses/compra/VP/stock final/meses fin. Panel IMPO por mes. Ventana de 4 meses con flechas ◀▶.</w:t>
       </w:r>
     </w:p>
     <w:p>
@@ -342,28 +534,13 @@
         <w:rPr>
           <w:b/>
         </w:rPr>
-        <w:t xml:space="preserve">CMM</w:t>
-      </w:r>
-      <w:r>
-        <w:t xml:space="preserve"> </w:t>
-      </w:r>
-      <w:r>
-        <w:t xml:space="preserve">= (Lista1×0,7×0,93 − Costo) / (Lista1×0,7).</w:t>
-      </w:r>
-      <w:r>
-        <w:t xml:space="preserve"> </w:t>
-      </w:r>
-      <w:r>
-        <w:rPr>
-          <w:b/>
-        </w:rPr>
-        <w:t xml:space="preserve">CMM Liq.</w:t>
-      </w:r>
-      <w:r>
-        <w:t xml:space="preserve"> </w:t>
-      </w:r>
-      <w:r>
-        <w:t xml:space="preserve">= igual con Dto Liq: (Lista1×(1−DtoLiq)×0,7×0,93 − Costo)/(Lista1×(1−DtoLiq)×0,7). Dto Máx = mayor dto con contribución ≥ mín (def 10%); Dto Liq = Máx − gap (def 5%).</w:t>
+        <w:t xml:space="preserve">Liquidación</w:t>
+      </w:r>
+      <w:r>
+        <w:t xml:space="preserve"> </w:t>
+      </w:r>
+      <w:r>
+        <w:t xml:space="preserve">— Candidatos con exceso positivo. Preview + Excel (idénticos). Segmentos: Producto (Grupo, Código, Cat., Ideal, VP, Costo, CMM, Lista Base, Lista Mix), Exceso stock (Stock U., Exceso U., Meses de stock, Exceso meses), Exceso $-USD (Costo total, Mix total), Liquidación (Dto. Máx., Lista Dto. Máx., Dto. Liq., Mix total Liq., CMM Liq.), Contribución marginal por % (colapsable). Totales arriba. 3 gráficos de excedente (unidades/costo/precio Mix) sobre el stock total filtrado. Ordenamiento por click.</w:t>
       </w:r>
     </w:p>
     <w:p>
@@ -378,43 +555,13 @@
         <w:rPr>
           <w:b/>
         </w:rPr>
-        <w:t xml:space="preserve">Lista Base</w:t>
-      </w:r>
-      <w:r>
-        <w:t xml:space="preserve"> </w:t>
-      </w:r>
-      <w:r>
-        <w:t xml:space="preserve">= Lista 1 (J).</w:t>
-      </w:r>
-      <w:r>
-        <w:t xml:space="preserve"> </w:t>
-      </w:r>
-      <w:r>
-        <w:rPr>
-          <w:b/>
-        </w:rPr>
-        <w:t xml:space="preserve">Lista Mix</w:t>
-      </w:r>
-      <w:r>
-        <w:t xml:space="preserve"> </w:t>
-      </w:r>
-      <w:r>
-        <w:t xml:space="preserve">= precio ponderado (Forecast AS).</w:t>
-      </w:r>
-      <w:r>
-        <w:t xml:space="preserve"> </w:t>
-      </w:r>
-      <w:r>
-        <w:rPr>
-          <w:b/>
-        </w:rPr>
-        <w:t xml:space="preserve">Lista Dto. Máx.</w:t>
-      </w:r>
-      <w:r>
-        <w:t xml:space="preserve"> </w:t>
-      </w:r>
-      <w:r>
-        <w:t xml:space="preserve">= Lista1×0,7×(1−DtoMáx) (PV mínimo).</w:t>
+        <w:t xml:space="preserve">Proyección</w:t>
+      </w:r>
+      <w:r>
+        <w:t xml:space="preserve"> </w:t>
+      </w:r>
+      <w:r>
+        <w:t xml:space="preserve">— Por GA/categoría/código y por mes: VA c/stk, %, V.P. u, CMV, CMV/Vta, Venta $-USD + tendencia. Encabezado: TC editable, CMV/TVP y % en pesos. Ventana de 4 meses. Excel.</w:t>
       </w:r>
     </w:p>
     <w:p>
@@ -429,127 +576,22 @@
         <w:rPr>
           <w:b/>
         </w:rPr>
-        <w:t xml:space="preserve">Costo total</w:t>
-      </w:r>
-      <w:r>
-        <w:t xml:space="preserve"> </w:t>
-      </w:r>
-      <w:r>
-        <w:t xml:space="preserve">= Costo × Exceso U.</w:t>
-      </w:r>
-      <w:r>
-        <w:t xml:space="preserve"> </w:t>
-      </w:r>
-      <w:r>
-        <w:rPr>
-          <w:b/>
-        </w:rPr>
-        <w:t xml:space="preserve">Mix total</w:t>
-      </w:r>
-      <w:r>
-        <w:t xml:space="preserve"> </w:t>
-      </w:r>
-      <w:r>
-        <w:t xml:space="preserve">= Lista Mix × Exceso U.</w:t>
-      </w:r>
-      <w:r>
-        <w:t xml:space="preserve"> </w:t>
-      </w:r>
-      <w:r>
-        <w:rPr>
-          <w:b/>
-        </w:rPr>
-        <w:t xml:space="preserve">Mix total Liq. (Obj. Liq.)</w:t>
-      </w:r>
-      <w:r>
-        <w:t xml:space="preserve"> </w:t>
-      </w:r>
-      <w:r>
-        <w:t xml:space="preserve">= Lista Mix × (1−Dto Liq) × Exceso U.</w:t>
-      </w:r>
-    </w:p>
-    <w:p>
-      <w:pPr>
-        <w:numPr>
-          <w:ilvl w:val="0"/>
-          <w:numId w:val="1003"/>
-        </w:numPr>
-        <w:pStyle w:val="Compact"/>
-      </w:pPr>
-      <w:r>
-        <w:rPr>
-          <w:b/>
-        </w:rPr>
-        <w:t xml:space="preserve">Proyección:</w:t>
-      </w:r>
-      <w:r>
-        <w:t xml:space="preserve"> </w:t>
-      </w:r>
-      <w:r>
-        <w:t xml:space="preserve">VA c/stk = valor tal cual de</w:t>
-      </w:r>
-      <w:r>
-        <w:t xml:space="preserve"> </w:t>
-      </w:r>
-      <w:r>
-        <w:t xml:space="preserve">“</w:t>
-      </w:r>
-      <w:r>
-        <w:t xml:space="preserve">V.Ajust. c/stock</w:t>
-      </w:r>
-      <w:r>
-        <w:t xml:space="preserve">”</w:t>
-      </w:r>
-      <w:r>
-        <w:t xml:space="preserve"> </w:t>
-      </w:r>
-      <w:r>
-        <w:t xml:space="preserve">(sin ×estacionalidad). CMV = Costo × V.P. u. Venta $-USD = venta proy. USD. CMV/Vta = CMV/Venta.</w:t>
-      </w:r>
-    </w:p>
-    <w:p>
-      <w:pPr>
-        <w:numPr>
-          <w:ilvl w:val="0"/>
-          <w:numId w:val="1003"/>
-        </w:numPr>
-        <w:pStyle w:val="Compact"/>
-      </w:pPr>
-      <w:r>
-        <w:rPr>
-          <w:b/>
-        </w:rPr>
-        <w:t xml:space="preserve">Histórico:</w:t>
-      </w:r>
-      <w:r>
-        <w:t xml:space="preserve"> </w:t>
-      </w:r>
-      <w:r>
-        <w:t xml:space="preserve">V.P. del mes = CJ+1 del archivo</w:t>
-      </w:r>
-      <w:r>
-        <w:t xml:space="preserve"> </w:t>
-      </w:r>
-      <w:r>
-        <w:t xml:space="preserve">“</w:t>
-      </w:r>
-      <w:r>
-        <w:t xml:space="preserve">Forecast MM-AA</w:t>
-      </w:r>
-      <w:r>
-        <w:t xml:space="preserve">”</w:t>
-      </w:r>
-      <w:r>
-        <w:t xml:space="preserve">. V.R. u = AB–AM del vivo (abs). V.P. $-USD = MIX × V.P. u. V.R. $-USD = venta real facturada (archivo Venta_real). % = (real − proy)/proy.</w:t>
+        <w:t xml:space="preserve">Histórico</w:t>
+      </w:r>
+      <w:r>
+        <w:t xml:space="preserve"> </w:t>
+      </w:r>
+      <w:r>
+        <w:t xml:space="preserve">— Precisión del forecast: por mes, V.P. u / % / V.R. u / V.P. $-USD / % / V.R. $-USD. Importados en USD, Distribuidos/Reconstruidos en $. Ventana de 4 meses.</w:t>
       </w:r>
     </w:p>
     <w:p>
       <w:pPr>
         <w:pStyle w:val="Heading3"/>
       </w:pPr>
-      <w:bookmarkStart w:id="26" w:name="estética-formato"/>
-      <w:r>
-        <w:t xml:space="preserve">Estética / formato</w:t>
+      <w:bookmarkStart w:id="26" w:name="lógica-clave"/>
+      <w:r>
+        <w:t xml:space="preserve">Lógica clave</w:t>
       </w:r>
       <w:bookmarkEnd w:id="26"/>
     </w:p>
@@ -562,22 +604,16 @@
         <w:pStyle w:val="Compact"/>
       </w:pPr>
       <w:r>
-        <w:t xml:space="preserve">Todas las tablas: encabezado azul, letra blanca,</w:t>
-      </w:r>
-      <w:r>
-        <w:t xml:space="preserve"> </w:t>
-      </w:r>
-      <w:r>
-        <w:rPr>
-          <w:b/>
-        </w:rPr>
-        <w:t xml:space="preserve">línea amarilla como corte</w:t>
-      </w:r>
-      <w:r>
-        <w:t xml:space="preserve"> </w:t>
-      </w:r>
-      <w:r>
-        <w:t xml:space="preserve">entre encabezado y datos (el segmento Liquidación va invertido: amarillo con letra azul).</w:t>
+        <w:rPr>
+          <w:b/>
+        </w:rPr>
+        <w:t xml:space="preserve">Exceso (método B):</w:t>
+      </w:r>
+      <w:r>
+        <w:t xml:space="preserve"> </w:t>
+      </w:r>
+      <w:r>
+        <w:t xml:space="preserve">Exceso unid. = Stock − suma de la V.P. de los meses del Ideal; el factor ×N extiende el horizonte; sólo exceso &gt; 0.</w:t>
       </w:r>
     </w:p>
     <w:p>
@@ -592,13 +628,28 @@
         <w:rPr>
           <w:b/>
         </w:rPr>
-        <w:t xml:space="preserve">Totales:</w:t>
-      </w:r>
-      <w:r>
-        <w:t xml:space="preserve"> </w:t>
-      </w:r>
-      <w:r>
-        <w:t xml:space="preserve">gris claro, letra negra, importes con su color (Costo rojo, Mix/Obj verde).</w:t>
+        <w:t xml:space="preserve">CMM</w:t>
+      </w:r>
+      <w:r>
+        <w:t xml:space="preserve"> </w:t>
+      </w:r>
+      <w:r>
+        <w:t xml:space="preserve">= (Lista1×0,7×0,93 − Costo) / (Lista1×0,7).</w:t>
+      </w:r>
+      <w:r>
+        <w:t xml:space="preserve"> </w:t>
+      </w:r>
+      <w:r>
+        <w:rPr>
+          <w:b/>
+        </w:rPr>
+        <w:t xml:space="preserve">CMM Liq.</w:t>
+      </w:r>
+      <w:r>
+        <w:t xml:space="preserve"> </w:t>
+      </w:r>
+      <w:r>
+        <w:t xml:space="preserve">= igual con Dto Liq. Dto Máx = mayor dto con contribución ≥ mín (def 10%); Dto Liq = Máx − gap (def 5%).</w:t>
       </w:r>
     </w:p>
     <w:p>
@@ -610,34 +661,46 @@
         <w:pStyle w:val="Compact"/>
       </w:pPr>
       <w:r>
-        <w:t xml:space="preserve">Excels (Liquidación y Proyección):</w:t>
-      </w:r>
-      <w:r>
-        <w:t xml:space="preserve"> </w:t>
-      </w:r>
-      <w:r>
-        <w:rPr>
-          <w:b/>
-        </w:rPr>
-        <w:t xml:space="preserve">mismo formato que el preview</w:t>
-      </w:r>
-      <w:r>
-        <w:t xml:space="preserve">, con números en</w:t>
-      </w:r>
-      <w:r>
-        <w:t xml:space="preserve"> </w:t>
-      </w:r>
-      <w:r>
-        <w:rPr>
-          <w:b/>
-        </w:rPr>
-        <w:t xml:space="preserve">formato Contabilidad USD / $</w:t>
-      </w:r>
-      <w:r>
-        <w:t xml:space="preserve"> </w:t>
-      </w:r>
-      <w:r>
-        <w:t xml:space="preserve">(numérico, se pueden sumar).</w:t>
+        <w:rPr>
+          <w:b/>
+        </w:rPr>
+        <w:t xml:space="preserve">Lista Base</w:t>
+      </w:r>
+      <w:r>
+        <w:t xml:space="preserve"> </w:t>
+      </w:r>
+      <w:r>
+        <w:t xml:space="preserve">= Lista 1 (J).</w:t>
+      </w:r>
+      <w:r>
+        <w:t xml:space="preserve"> </w:t>
+      </w:r>
+      <w:r>
+        <w:rPr>
+          <w:b/>
+        </w:rPr>
+        <w:t xml:space="preserve">Lista Mix</w:t>
+      </w:r>
+      <w:r>
+        <w:t xml:space="preserve"> </w:t>
+      </w:r>
+      <w:r>
+        <w:t xml:space="preserve">= precio ponderado (Forecast AS).</w:t>
+      </w:r>
+      <w:r>
+        <w:t xml:space="preserve"> </w:t>
+      </w:r>
+      <w:r>
+        <w:rPr>
+          <w:b/>
+        </w:rPr>
+        <w:t xml:space="preserve">Lista Dto. Máx.</w:t>
+      </w:r>
+      <w:r>
+        <w:t xml:space="preserve"> </w:t>
+      </w:r>
+      <w:r>
+        <w:t xml:space="preserve">= Lista1×0,7×(1−DtoMáx).</w:t>
       </w:r>
     </w:p>
     <w:p>
@@ -649,28 +712,145 @@
         <w:pStyle w:val="Compact"/>
       </w:pPr>
       <w:r>
-        <w:t xml:space="preserve">El generador</w:t>
-      </w:r>
-      <w:r>
-        <w:t xml:space="preserve"> </w:t>
-      </w:r>
-      <w:r>
-        <w:rPr>
-          <w:b/>
-        </w:rPr>
-        <w:t xml:space="preserve">no pre-redondea</w:t>
-      </w:r>
-      <w:r>
-        <w:t xml:space="preserve">: los valores coinciden con Excel.</w:t>
+        <w:rPr>
+          <w:b/>
+        </w:rPr>
+        <w:t xml:space="preserve">Costo total</w:t>
+      </w:r>
+      <w:r>
+        <w:t xml:space="preserve"> </w:t>
+      </w:r>
+      <w:r>
+        <w:t xml:space="preserve">= Costo × Exceso U.</w:t>
+      </w:r>
+      <w:r>
+        <w:t xml:space="preserve"> </w:t>
+      </w:r>
+      <w:r>
+        <w:rPr>
+          <w:b/>
+        </w:rPr>
+        <w:t xml:space="preserve">Mix total</w:t>
+      </w:r>
+      <w:r>
+        <w:t xml:space="preserve"> </w:t>
+      </w:r>
+      <w:r>
+        <w:t xml:space="preserve">= Lista Mix × Exceso U.</w:t>
+      </w:r>
+      <w:r>
+        <w:t xml:space="preserve"> </w:t>
+      </w:r>
+      <w:r>
+        <w:rPr>
+          <w:b/>
+        </w:rPr>
+        <w:t xml:space="preserve">Mix total Liq. (Obj. Liq.)</w:t>
+      </w:r>
+      <w:r>
+        <w:t xml:space="preserve"> </w:t>
+      </w:r>
+      <w:r>
+        <w:t xml:space="preserve">= Lista Mix × (1−Dto Liq) × Exceso U.</w:t>
+      </w:r>
+    </w:p>
+    <w:p>
+      <w:pPr>
+        <w:numPr>
+          <w:ilvl w:val="0"/>
+          <w:numId w:val="1004"/>
+        </w:numPr>
+        <w:pStyle w:val="Compact"/>
+      </w:pPr>
+      <w:r>
+        <w:rPr>
+          <w:b/>
+        </w:rPr>
+        <w:t xml:space="preserve">Proyección:</w:t>
+      </w:r>
+      <w:r>
+        <w:t xml:space="preserve"> </w:t>
+      </w:r>
+      <w:r>
+        <w:t xml:space="preserve">VA c/stk = valor de</w:t>
+      </w:r>
+      <w:r>
+        <w:t xml:space="preserve"> </w:t>
+      </w:r>
+      <w:r>
+        <w:t xml:space="preserve">“</w:t>
+      </w:r>
+      <w:r>
+        <w:t xml:space="preserve">V.Ajust. c/stock</w:t>
+      </w:r>
+      <w:r>
+        <w:t xml:space="preserve">”</w:t>
+      </w:r>
+      <w:r>
+        <w:t xml:space="preserve"> </w:t>
+      </w:r>
+      <w:r>
+        <w:t xml:space="preserve">(sin ×estacionalidad). CMV = Costo × V.P. u. CMV/Vta = CMV/Venta.</w:t>
+      </w:r>
+    </w:p>
+    <w:p>
+      <w:pPr>
+        <w:numPr>
+          <w:ilvl w:val="0"/>
+          <w:numId w:val="1004"/>
+        </w:numPr>
+        <w:pStyle w:val="Compact"/>
+      </w:pPr>
+      <w:r>
+        <w:rPr>
+          <w:b/>
+        </w:rPr>
+        <w:t xml:space="preserve">Histórico:</w:t>
+      </w:r>
+      <w:r>
+        <w:t xml:space="preserve"> </w:t>
+      </w:r>
+      <w:r>
+        <w:t xml:space="preserve">V.P. del mes = CJ+1 del archivo</w:t>
+      </w:r>
+      <w:r>
+        <w:t xml:space="preserve"> </w:t>
+      </w:r>
+      <w:r>
+        <w:t xml:space="preserve">“</w:t>
+      </w:r>
+      <w:r>
+        <w:t xml:space="preserve">Forecast MM-AA</w:t>
+      </w:r>
+      <w:r>
+        <w:t xml:space="preserve">”</w:t>
+      </w:r>
+      <w:r>
+        <w:t xml:space="preserve">. V.R. u = AB–AM del vivo (abs). V.P. $-USD = MIX × V.P. u.</w:t>
+      </w:r>
+      <w:r>
+        <w:t xml:space="preserve"> </w:t>
+      </w:r>
+      <w:r>
+        <w:rPr>
+          <w:b/>
+        </w:rPr>
+        <w:t xml:space="preserve">V.R. $-USD = venta real facturada del archivo V.R. mensual (USD para Importados, $ para Nacionales).</w:t>
+      </w:r>
+      <w:r>
+        <w:t xml:space="preserve"> </w:t>
+      </w:r>
+      <w:r>
+        <w:t xml:space="preserve">% = (real − proy)/proy.</w:t>
       </w:r>
     </w:p>
     <w:p>
       <w:pPr>
         <w:pStyle w:val="Heading3"/>
       </w:pPr>
-      <w:bookmarkStart w:id="27" w:name="rendimiento"/>
-      <w:r>
-        <w:t xml:space="preserve">Rendimiento</w:t>
+      <w:bookmarkStart w:id="27" w:name="estética-formato"/>
+      <w:r>
+        <w:t xml:space="preserve">Estética / formato</w:t>
       </w:r>
       <w:bookmarkEnd w:id="27"/>
     </w:p>
@@ -683,43 +863,7 @@
         <w:pStyle w:val="Compact"/>
       </w:pPr>
       <w:r>
-        <w:rPr>
-          <w:b/>
-        </w:rPr>
-        <w:t xml:space="preserve">Cache Histórico</w:t>
-      </w:r>
-      <w:r>
-        <w:t xml:space="preserve"> </w:t>
-      </w:r>
-      <w:r>
-        <w:t xml:space="preserve">(</w:t>
-      </w:r>
-      <w:r>
-        <w:rPr>
-          <w:rStyle w:val="VerbatimChar"/>
-        </w:rPr>
-        <w:t xml:space="preserve">generador/historico_vp.json</w:t>
-      </w:r>
-      <w:r>
-        <w:t xml:space="preserve">): los</w:t>
-      </w:r>
-      <w:r>
-        <w:t xml:space="preserve"> </w:t>
-      </w:r>
-      <w:r>
-        <w:t xml:space="preserve">“</w:t>
-      </w:r>
-      <w:r>
-        <w:t xml:space="preserve">Forecast MM-AA</w:t>
-      </w:r>
-      <w:r>
-        <w:t xml:space="preserve">”</w:t>
-      </w:r>
-      <w:r>
-        <w:t xml:space="preserve"> </w:t>
-      </w:r>
-      <w:r>
-        <w:t xml:space="preserve">se abren 1 sola vez (VP + MIX). Un mes nuevo se detecta y se agrega solo.</w:t>
+        <w:t xml:space="preserve">Encabezado azul, letra blanca, línea amarilla como corte entre encabezado y datos (Liquidación invertido: amarillo/letra azul).</w:t>
       </w:r>
     </w:p>
     <w:p>
@@ -731,25 +875,28 @@
         <w:pStyle w:val="Compact"/>
       </w:pPr>
       <w:r>
-        <w:rPr>
-          <w:rStyle w:val="VerbatimChar"/>
-        </w:rPr>
-        <w:t xml:space="preserve">visibleRows</w:t>
-      </w:r>
-      <w:r>
-        <w:t xml:space="preserve"> </w:t>
-      </w:r>
-      <w:r>
-        <w:t xml:space="preserve">memoizado; debounce en filtros; cacheo por pestaña; ventana de 4 meses por vista.</w:t>
+        <w:t xml:space="preserve">Totales: gris claro, letra negra, importes con su color (Costo rojo, Mix/Obj verde).</w:t>
+      </w:r>
+    </w:p>
+    <w:p>
+      <w:pPr>
+        <w:numPr>
+          <w:ilvl w:val="0"/>
+          <w:numId w:val="1005"/>
+        </w:numPr>
+        <w:pStyle w:val="Compact"/>
+      </w:pPr>
+      <w:r>
+        <w:t xml:space="preserve">Excels de descarga idénticos al preview, con formato Contabilidad USD / $.</w:t>
       </w:r>
     </w:p>
     <w:p>
       <w:pPr>
         <w:pStyle w:val="Heading3"/>
       </w:pPr>
-      <w:bookmarkStart w:id="28" w:name="cómo-actualizar"/>
-      <w:r>
-        <w:t xml:space="preserve">Cómo actualizar</w:t>
+      <w:bookmarkStart w:id="28" w:name="rendimiento"/>
+      <w:r>
+        <w:t xml:space="preserve">Rendimiento</w:t>
       </w:r>
       <w:bookmarkEnd w:id="28"/>
     </w:p>
@@ -762,7 +909,34 @@
         <w:pStyle w:val="Compact"/>
       </w:pPr>
       <w:r>
-        <w:t xml:space="preserve">Guardar Forecast.xlsm, Costos.xlsm y Venta_real*.xlsx actualizados en la carpeta.</w:t>
+        <w:t xml:space="preserve">Cache Histórico (</w:t>
+      </w:r>
+      <w:r>
+        <w:rPr>
+          <w:rStyle w:val="VerbatimChar"/>
+        </w:rPr>
+        <w:t xml:space="preserve">generador/historico_vp.json</w:t>
+      </w:r>
+      <w:r>
+        <w:t xml:space="preserve">): los</w:t>
+      </w:r>
+      <w:r>
+        <w:t xml:space="preserve"> </w:t>
+      </w:r>
+      <w:r>
+        <w:t xml:space="preserve">“</w:t>
+      </w:r>
+      <w:r>
+        <w:t xml:space="preserve">Forecast MM-AA</w:t>
+      </w:r>
+      <w:r>
+        <w:t xml:space="preserve">”</w:t>
+      </w:r>
+      <w:r>
+        <w:t xml:space="preserve"> </w:t>
+      </w:r>
+      <w:r>
+        <w:t xml:space="preserve">se abren 1 vez. Un mes nuevo se detecta y se agrega solo.</w:t>
       </w:r>
     </w:p>
     <w:p>
@@ -774,52 +948,98 @@
         <w:pStyle w:val="Compact"/>
       </w:pPr>
       <w:r>
-        <w:t xml:space="preserve">Doble clic en</w:t>
-      </w:r>
-      <w:r>
-        <w:t xml:space="preserve"> </w:t>
-      </w:r>
-      <w:r>
-        <w:rPr>
-          <w:b/>
-        </w:rPr>
-        <w:t xml:space="preserve">Subir_a_GitHub.bat</w:t>
-      </w:r>
-      <w:r>
-        <w:t xml:space="preserve"> </w:t>
-      </w:r>
-      <w:r>
-        <w:t xml:space="preserve">→ regenera y publica. (La 1ª vez que aparece un mes nuevo tarda unos minutos; después es rápido.) Requiere Python instalado.</w:t>
-      </w:r>
+        <w:rPr>
+          <w:rStyle w:val="VerbatimChar"/>
+        </w:rPr>
+        <w:t xml:space="preserve">visibleRows</w:t>
+      </w:r>
+      <w:r>
+        <w:t xml:space="preserve"> </w:t>
+      </w:r>
+      <w:r>
+        <w:t xml:space="preserve">memoizado; debounce en filtros; cacheo por pestaña; ventana de 4 meses por vista.</w:t>
+      </w:r>
+    </w:p>
+    <w:p>
+      <w:pPr>
+        <w:pStyle w:val="Heading3"/>
+      </w:pPr>
+      <w:bookmarkStart w:id="29" w:name="cómo-actualizar"/>
+      <w:r>
+        <w:t xml:space="preserve">Cómo actualizar</w:t>
+      </w:r>
+      <w:bookmarkEnd w:id="29"/>
     </w:p>
     <w:p>
       <w:pPr>
         <w:numPr>
           <w:ilvl w:val="0"/>
-          <w:numId w:val="1006"/>
+          <w:numId w:val="1007"/>
         </w:numPr>
         <w:pStyle w:val="Compact"/>
       </w:pPr>
       <w:r>
-        <w:t xml:space="preserve">Ctrl+F5 en la URL.</w:t>
+        <w:t xml:space="preserve">Guardar Forecast.xlsm, Costos.xlsm y</w:t>
+      </w:r>
+      <w:r>
+        <w:t xml:space="preserve"> </w:t>
+      </w:r>
+      <w:r>
+        <w:rPr>
+          <w:b/>
+        </w:rPr>
+        <w:t xml:space="preserve">V.R. mensual.xlsx</w:t>
+      </w:r>
+      <w:r>
+        <w:t xml:space="preserve"> </w:t>
+      </w:r>
+      <w:r>
+        <w:t xml:space="preserve">actualizados en la carpeta del Drive (junto al Forecast).</w:t>
+      </w:r>
+    </w:p>
+    <w:p>
+      <w:pPr>
+        <w:numPr>
+          <w:ilvl w:val="0"/>
+          <w:numId w:val="1007"/>
+        </w:numPr>
+        <w:pStyle w:val="Compact"/>
+      </w:pPr>
+      <w:r>
+        <w:t xml:space="preserve">Doble clic en</w:t>
+      </w:r>
+      <w:r>
+        <w:t xml:space="preserve"> </w:t>
+      </w:r>
+      <w:r>
+        <w:rPr>
+          <w:b/>
+        </w:rPr>
+        <w:t xml:space="preserve">Subir_a_GitHub.bat</w:t>
+      </w:r>
+      <w:r>
+        <w:t xml:space="preserve"> </w:t>
+      </w:r>
+      <w:r>
+        <w:t xml:space="preserve">→ regenera y publica. Ctrl+F5 en la URL.</w:t>
       </w:r>
     </w:p>
     <w:p>
       <w:pPr>
         <w:pStyle w:val="Heading3"/>
       </w:pPr>
-      <w:bookmarkStart w:id="29" w:name="archivos"/>
+      <w:bookmarkStart w:id="30" w:name="archivos"/>
       <w:r>
         <w:t xml:space="preserve">Archivos</w:t>
       </w:r>
-      <w:bookmarkEnd w:id="29"/>
+      <w:bookmarkEnd w:id="30"/>
     </w:p>
     <w:p>
       <w:pPr>
         <w:pStyle w:val="FirstParagraph"/>
       </w:pPr>
       <w:r>
-        <w:t xml:space="preserve">Dashboard_Forecast.html · Subir_a_GitHub.bat · generador/ (plantilla.html, generar_dashboard.py, historico_vp.json) · Memoria/ Prompt/ Skills/.</w:t>
+        <w:t xml:space="preserve">Dashboard_Forecast.html · Subir_a_GitHub.bat · .gitignore · generador/ (plantilla.html, generar_dashboard.py, historico_vp.json) · Memoria/ Prompt/ Skills/.</w:t>
       </w:r>
     </w:p>
     <w:sectPr/>
@@ -1177,6 +1397,9 @@
     <w:abstractNumId w:val="991"/>
   </w:num>
   <w:num w:numId="1002">
+    <w:abstractNumId w:val="991"/>
+  </w:num>
+  <w:num w:numId="1003">
     <w:abstractNumId w:val="99411"/>
     <w:lvlOverride w:ilvl="0">
       <w:startOverride w:val="1"/>
@@ -1206,9 +1429,6 @@
       <w:startOverride w:val="1"/>
     </w:lvlOverride>
   </w:num>
-  <w:num w:numId="1003">
-    <w:abstractNumId w:val="991"/>
-  </w:num>
   <w:num w:numId="1004">
     <w:abstractNumId w:val="991"/>
   </w:num>
@@ -1216,6 +1436,9 @@
     <w:abstractNumId w:val="991"/>
   </w:num>
   <w:num w:numId="1006">
+    <w:abstractNumId w:val="991"/>
+  </w:num>
+  <w:num w:numId="1007">
     <w:abstractNumId w:val="99411"/>
     <w:lvlOverride w:ilvl="0">
       <w:startOverride w:val="1"/>

</xml_diff>

<commit_message>
Actualiza dashboard lun 03/08/2026 16:38:18,24
</commit_message>
<xml_diff>
--- a/Memoria/Memoria.docx
+++ b/Memoria/Memoria.docx
@@ -37,7 +37,19 @@
         <w:pStyle w:val="FirstParagraph"/>
       </w:pPr>
       <w:r>
-        <w:t xml:space="preserve">HTML autocontenido (un archivo) que resume el Forecast de compra-venta mensual, publicado en GitHub Pages. Todo se calcula desde los Excel; no depende de hojas auxiliares.</w:t>
+        <w:t xml:space="preserve">HTML autocontenido (un archivo) que resume el Forecast de compra-venta</w:t>
+      </w:r>
+      <w:r>
+        <w:t xml:space="preserve"> </w:t>
+      </w:r>
+      <w:r>
+        <w:t xml:space="preserve">mensual, publicado en GitHub Pages. Todo se calcula desde los Excel; no</w:t>
+      </w:r>
+      <w:r>
+        <w:t xml:space="preserve"> </w:t>
+      </w:r>
+      <w:r>
+        <w:t xml:space="preserve">depende de hojas auxiliares.</w:t>
       </w:r>
     </w:p>
     <w:p>
@@ -54,7 +66,13 @@
         <w:t xml:space="preserve"> </w:t>
       </w:r>
       <w:r>
-        <w:t xml:space="preserve">https://erik07-ee.github.io/Dashboard-Forecast/Dashboard_Forecast.html ·</w:t>
+        <w:t xml:space="preserve">https://erik07-ee.github.io/Dashboard-Forecast/Dashboard_Forecast.html</w:t>
+      </w:r>
+      <w:r>
+        <w:t xml:space="preserve"> </w:t>
+      </w:r>
+      <w:r>
+        <w:t xml:space="preserve">·</w:t>
       </w:r>
       <w:r>
         <w:t xml:space="preserve"> </w:t>
@@ -112,7 +130,19 @@
         <w:t xml:space="preserve">Forecast</w:t>
       </w:r>
       <w:r>
-        <w:t xml:space="preserve">): stock, ventas proyectadas, compras, IMPO, estacionalidad, tendencia, venta real en unidades (AB–AM), precio ponderado (MIX, col AS).</w:t>
+        <w:t xml:space="preserve">): stock, ventas proyectadas,</w:t>
+      </w:r>
+      <w:r>
+        <w:t xml:space="preserve"> </w:t>
+      </w:r>
+      <w:r>
+        <w:t xml:space="preserve">compras, IMPO, estacionalidad, tendencia, venta real en unidades</w:t>
+      </w:r>
+      <w:r>
+        <w:t xml:space="preserve"> </w:t>
+      </w:r>
+      <w:r>
+        <w:t xml:space="preserve">(AB–AM), precio ponderado (MIX, col AS).</w:t>
       </w:r>
     </w:p>
     <w:p>
@@ -145,7 +175,19 @@
         <w:t xml:space="preserve">General</w:t>
       </w:r>
       <w:r>
-        <w:t xml:space="preserve">): Costo=AC, Lista actual (Lista 1)=J, Moneda=I, Q=17 (lista nueva, uso futuro). La CMM la calcula el dashboard con Lista 1.</w:t>
+        <w:t xml:space="preserve">): Costo=AC, Lista actual (Lista</w:t>
+      </w:r>
+      <w:r>
+        <w:t xml:space="preserve"> </w:t>
+      </w:r>
+      <w:r>
+        <w:t xml:space="preserve">1)=J, Moneda=I, Q=17 (lista nueva, uso futuro). La CMM la calcula el</w:t>
+      </w:r>
+      <w:r>
+        <w:t xml:space="preserve"> </w:t>
+      </w:r>
+      <w:r>
+        <w:t xml:space="preserve">dashboard con Lista 1.</w:t>
       </w:r>
     </w:p>
     <w:p>
@@ -166,7 +208,19 @@
         <w:t xml:space="preserve"> </w:t>
       </w:r>
       <w:r>
-        <w:t xml:space="preserve">(archivos mensuales congelados): para el Histórico — VP del mes y precio MIX (se leen 1 vez y quedan en cache).</w:t>
+        <w:t xml:space="preserve">(archivos mensuales congelados): para el</w:t>
+      </w:r>
+      <w:r>
+        <w:t xml:space="preserve"> </w:t>
+      </w:r>
+      <w:r>
+        <w:t xml:space="preserve">Histórico — VP del mes y precio MIX (se leen 1 vez y quedan en</w:t>
+      </w:r>
+      <w:r>
+        <w:t xml:space="preserve"> </w:t>
+      </w:r>
+      <w:r>
+        <w:t xml:space="preserve">cache).</w:t>
       </w:r>
     </w:p>
     <w:p>
@@ -187,7 +241,13 @@
         <w:t xml:space="preserve"> </w:t>
       </w:r>
       <w:r>
-        <w:t xml:space="preserve">(venta real facturada): por código y mes. Alimenta la columna</w:t>
+        <w:t xml:space="preserve">(venta real facturada): por código y mes.</w:t>
+      </w:r>
+      <w:r>
+        <w:t xml:space="preserve"> </w:t>
+      </w:r>
+      <w:r>
+        <w:t xml:space="preserve">Alimenta la columna</w:t>
       </w:r>
       <w:r>
         <w:t xml:space="preserve"> </w:t>
@@ -202,7 +262,13 @@
         <w:t xml:space="preserve"> </w:t>
       </w:r>
       <w:r>
-        <w:t xml:space="preserve">del Histórico. Ver detalle abajo.</w:t>
+        <w:t xml:space="preserve">del Histórico. Ver detalle</w:t>
+      </w:r>
+      <w:r>
+        <w:t xml:space="preserve"> </w:t>
+      </w:r>
+      <w:r>
+        <w:t xml:space="preserve">abajo.</w:t>
       </w:r>
     </w:p>
     <w:p>
@@ -239,7 +305,19 @@
         <w:t xml:space="preserve"> </w:t>
       </w:r>
       <w:r>
-        <w:t xml:space="preserve">(export de facturación de SAP, línea por línea). Columnas usadas: Fecha (G), Código (O), Grupo artículo (P), Cantidad (Q), Total S/Desc. (U), TC (W).</w:t>
+        <w:t xml:space="preserve">(export de facturación de SAP, línea</w:t>
+      </w:r>
+      <w:r>
+        <w:t xml:space="preserve"> </w:t>
+      </w:r>
+      <w:r>
+        <w:t xml:space="preserve">por línea). Columnas usadas: Fecha (G), Código (O), Grupo artículo</w:t>
+      </w:r>
+      <w:r>
+        <w:t xml:space="preserve"> </w:t>
+      </w:r>
+      <w:r>
+        <w:t xml:space="preserve">(P), Cantidad (Q), Total S/Desc. (U), TC (W).</w:t>
       </w:r>
     </w:p>
     <w:p>
@@ -260,7 +338,13 @@
         <w:t xml:space="preserve"> </w:t>
       </w:r>
       <w:r>
-        <w:t xml:space="preserve">si TC &gt; 0 (Importados) → valor en</w:t>
+        <w:t xml:space="preserve">si TC &gt; 0</w:t>
+      </w:r>
+      <w:r>
+        <w:t xml:space="preserve"> </w:t>
+      </w:r>
+      <w:r>
+        <w:t xml:space="preserve">(Importados) → valor en</w:t>
       </w:r>
       <w:r>
         <w:t xml:space="preserve"> </w:t>
@@ -275,7 +359,19 @@
         <w:t xml:space="preserve"> </w:t>
       </w:r>
       <w:r>
-        <w:t xml:space="preserve">= Total ÷ TC. Si TC = 0/vacío (Nacionales: Distribución, Complementario, Fabricación, Varios) → valor en</w:t>
+        <w:t xml:space="preserve">= Total ÷ TC. Si TC = 0/vacío</w:t>
+      </w:r>
+      <w:r>
+        <w:t xml:space="preserve"> </w:t>
+      </w:r>
+      <w:r>
+        <w:t xml:space="preserve">(Nacionales: Distribución, Complementario, Fabricación, Varios) →</w:t>
+      </w:r>
+      <w:r>
+        <w:t xml:space="preserve"> </w:t>
+      </w:r>
+      <w:r>
+        <w:t xml:space="preserve">valor en</w:t>
       </w:r>
       <w:r>
         <w:t xml:space="preserve"> </w:t>
@@ -320,7 +416,13 @@
         <w:t xml:space="preserve">“</w:t>
       </w:r>
       <w:r>
-        <w:t xml:space="preserve">Grupo artículo / Código / Cantidad tot. / VR $-USD</w:t>
+        <w:t xml:space="preserve">Grupo artículo / Código /</w:t>
+      </w:r>
+      <w:r>
+        <w:t xml:space="preserve"> </w:t>
+      </w:r>
+      <w:r>
+        <w:t xml:space="preserve">Cantidad tot. / VR $-USD</w:t>
       </w:r>
       <w:r>
         <w:t xml:space="preserve">”</w:t>
@@ -443,7 +545,13 @@
         <w:t xml:space="preserve">V R *</w:t>
       </w:r>
       <w:r>
-        <w:t xml:space="preserve">. La subcolumna de valor se reconoce si su rótulo contiene</w:t>
+        <w:t xml:space="preserve">. La subcolumna de valor se reconoce si su</w:t>
+      </w:r>
+      <w:r>
+        <w:t xml:space="preserve"> </w:t>
+      </w:r>
+      <w:r>
+        <w:t xml:space="preserve">rótulo contiene</w:t>
       </w:r>
       <w:r>
         <w:t xml:space="preserve"> </w:t>
@@ -519,7 +627,37 @@
         <w:t xml:space="preserve"> </w:t>
       </w:r>
       <w:r>
-        <w:t xml:space="preserve">— Tabla por código: stock, meses, y por mes stock inicio/meses/compra/VP/stock final/meses fin. Panel IMPO por mes. Ventana de 4 meses con flechas ◀▶.</w:t>
+        <w:t xml:space="preserve">— Tabla por código: stock, meses, y por mes stock</w:t>
+      </w:r>
+      <w:r>
+        <w:t xml:space="preserve"> </w:t>
+      </w:r>
+      <w:r>
+        <w:t xml:space="preserve">inicio/meses/compra/VP/stock final/meses fin. Panel IMPO por mes. Los meses con compra proyectada pero sin número de pedido muestran una tarjeta</w:t>
+      </w:r>
+      <w:r>
+        <w:t xml:space="preserve"> </w:t>
+      </w:r>
+      <w:r>
+        <w:t xml:space="preserve">“</w:t>
+      </w:r>
+      <w:r>
+        <w:t xml:space="preserve">Proyectado</w:t>
+      </w:r>
+      <w:r>
+        <w:t xml:space="preserve">”</w:t>
+      </w:r>
+      <w:r>
+        <w:t xml:space="preserve"> </w:t>
+      </w:r>
+      <w:r>
+        <w:t xml:space="preserve">(misma cantidad que la columna COMPRA); los que tienen número siguen como pedido normal.</w:t>
+      </w:r>
+      <w:r>
+        <w:t xml:space="preserve"> </w:t>
+      </w:r>
+      <w:r>
+        <w:t xml:space="preserve">Ventana de 4 meses con flechas ◀▶.</w:t>
       </w:r>
     </w:p>
     <w:p>
@@ -540,7 +678,49 @@
         <w:t xml:space="preserve"> </w:t>
       </w:r>
       <w:r>
-        <w:t xml:space="preserve">— Candidatos con exceso positivo. Preview + Excel (idénticos). Segmentos: Producto (Grupo, Código, Cat., Ideal, VP, Costo, CMM, Lista Base, Lista Mix), Exceso stock (Stock U., Exceso U., Meses de stock, Exceso meses), Exceso $-USD (Costo total, Mix total), Liquidación (Dto. Máx., Lista Dto. Máx., Dto. Liq., Mix total Liq., CMM Liq.), Contribución marginal por % (colapsable). Totales arriba. 3 gráficos de excedente (unidades/costo/precio Mix) sobre el stock total filtrado. Ordenamiento por click.</w:t>
+        <w:t xml:space="preserve">— Candidatos con exceso positivo. Preview + Excel</w:t>
+      </w:r>
+      <w:r>
+        <w:t xml:space="preserve"> </w:t>
+      </w:r>
+      <w:r>
+        <w:t xml:space="preserve">(idénticos). Segmentos: Producto (Grupo, Código, Cat., Ideal, VP,</w:t>
+      </w:r>
+      <w:r>
+        <w:t xml:space="preserve"> </w:t>
+      </w:r>
+      <w:r>
+        <w:t xml:space="preserve">Costo, CMM, Lista Base, Lista Mix), Exceso stock (Stock U., Exceso</w:t>
+      </w:r>
+      <w:r>
+        <w:t xml:space="preserve"> </w:t>
+      </w:r>
+      <w:r>
+        <w:t xml:space="preserve">U., Meses de stock, Exceso meses), Exceso $-USD (Costo total, Mix</w:t>
+      </w:r>
+      <w:r>
+        <w:t xml:space="preserve"> </w:t>
+      </w:r>
+      <w:r>
+        <w:t xml:space="preserve">total), Liquidación (Dto. Máx., Lista Dto. Máx., Dto. Liq., Mix</w:t>
+      </w:r>
+      <w:r>
+        <w:t xml:space="preserve"> </w:t>
+      </w:r>
+      <w:r>
+        <w:t xml:space="preserve">total Liq., CMM Liq.), Contribución marginal por % (colapsable).</w:t>
+      </w:r>
+      <w:r>
+        <w:t xml:space="preserve"> </w:t>
+      </w:r>
+      <w:r>
+        <w:t xml:space="preserve">Totales arriba. 3 gráficos de excedente (unidades/costo/precio Mix)</w:t>
+      </w:r>
+      <w:r>
+        <w:t xml:space="preserve"> </w:t>
+      </w:r>
+      <w:r>
+        <w:t xml:space="preserve">sobre el stock total filtrado. Ordenamiento por click.</w:t>
       </w:r>
     </w:p>
     <w:p>
@@ -561,7 +741,19 @@
         <w:t xml:space="preserve"> </w:t>
       </w:r>
       <w:r>
-        <w:t xml:space="preserve">— Por GA/categoría/código y por mes: VA c/stk, %, V.P. u, CMV, CMV/Vta, Venta $-USD + tendencia. Encabezado: TC editable, CMV/TVP y % en pesos. Ventana de 4 meses. Excel.</w:t>
+        <w:t xml:space="preserve">— Por GA/categoría/código y por mes: VA c/stk, %,</w:t>
+      </w:r>
+      <w:r>
+        <w:t xml:space="preserve"> </w:t>
+      </w:r>
+      <w:r>
+        <w:t xml:space="preserve">V.P. u, CMV, CMV/Vta, Venta $-USD + tendencia. Encabezado: TC</w:t>
+      </w:r>
+      <w:r>
+        <w:t xml:space="preserve"> </w:t>
+      </w:r>
+      <w:r>
+        <w:t xml:space="preserve">editable, CMV/TVP y % en pesos. Ventana de 4 meses. Excel.</w:t>
       </w:r>
     </w:p>
     <w:p>
@@ -582,7 +774,19 @@
         <w:t xml:space="preserve"> </w:t>
       </w:r>
       <w:r>
-        <w:t xml:space="preserve">— Precisión del forecast: por mes, V.P. u / % / V.R. u / V.P. $-USD / % / V.R. $-USD. Importados en USD, Distribuidos/Reconstruidos en $. Ventana de 4 meses.</w:t>
+        <w:t xml:space="preserve">— Precisión del forecast: por mes, V.P. u / % / V.R.</w:t>
+      </w:r>
+      <w:r>
+        <w:t xml:space="preserve"> </w:t>
+      </w:r>
+      <w:r>
+        <w:t xml:space="preserve">u / V.P. $-USD / % / V.R. $-USD. Importados en USD,</w:t>
+      </w:r>
+      <w:r>
+        <w:t xml:space="preserve"> </w:t>
+      </w:r>
+      <w:r>
+        <w:t xml:space="preserve">Distribuidos/Reconstruidos en $. Ventana de 4 meses.</w:t>
       </w:r>
     </w:p>
     <w:p>
@@ -613,7 +817,19 @@
         <w:t xml:space="preserve"> </w:t>
       </w:r>
       <w:r>
-        <w:t xml:space="preserve">Exceso unid. = Stock − suma de la V.P. de los meses del Ideal; el factor ×N extiende el horizonte; sólo exceso &gt; 0.</w:t>
+        <w:t xml:space="preserve">Exceso unid. = Stock − suma de la V.P. de los</w:t>
+      </w:r>
+      <w:r>
+        <w:t xml:space="preserve"> </w:t>
+      </w:r>
+      <w:r>
+        <w:t xml:space="preserve">meses del Ideal; el factor ×N extiende el horizonte; sólo</w:t>
+      </w:r>
+      <w:r>
+        <w:t xml:space="preserve"> </w:t>
+      </w:r>
+      <w:r>
+        <w:t xml:space="preserve">exceso &gt; 0.</w:t>
       </w:r>
     </w:p>
     <w:p>
@@ -649,7 +865,19 @@
         <w:t xml:space="preserve"> </w:t>
       </w:r>
       <w:r>
-        <w:t xml:space="preserve">= igual con Dto Liq. Dto Máx = mayor dto con contribución ≥ mín (def 10%); Dto Liq = Máx − gap (def 5%).</w:t>
+        <w:t xml:space="preserve">=</w:t>
+      </w:r>
+      <w:r>
+        <w:t xml:space="preserve"> </w:t>
+      </w:r>
+      <w:r>
+        <w:t xml:space="preserve">igual con Dto Liq. Dto Máx = mayor dto con contribución ≥ mín (def</w:t>
+      </w:r>
+      <w:r>
+        <w:t xml:space="preserve"> </w:t>
+      </w:r>
+      <w:r>
+        <w:t xml:space="preserve">10%); Dto Liq = Máx − gap (def 5%).</w:t>
       </w:r>
     </w:p>
     <w:p>
@@ -685,7 +913,13 @@
         <w:t xml:space="preserve"> </w:t>
       </w:r>
       <w:r>
-        <w:t xml:space="preserve">= precio ponderado (Forecast AS).</w:t>
+        <w:t xml:space="preserve">= precio ponderado</w:t>
+      </w:r>
+      <w:r>
+        <w:t xml:space="preserve"> </w:t>
+      </w:r>
+      <w:r>
+        <w:t xml:space="preserve">(Forecast AS).</w:t>
       </w:r>
       <w:r>
         <w:t xml:space="preserve"> </w:t>
@@ -736,7 +970,13 @@
         <w:t xml:space="preserve"> </w:t>
       </w:r>
       <w:r>
-        <w:t xml:space="preserve">= Lista Mix × Exceso U.</w:t>
+        <w:t xml:space="preserve">= Lista Mix ×</w:t>
+      </w:r>
+      <w:r>
+        <w:t xml:space="preserve"> </w:t>
+      </w:r>
+      <w:r>
+        <w:t xml:space="preserve">Exceso U.</w:t>
       </w:r>
       <w:r>
         <w:t xml:space="preserve"> </w:t>
@@ -751,7 +991,13 @@
         <w:t xml:space="preserve"> </w:t>
       </w:r>
       <w:r>
-        <w:t xml:space="preserve">= Lista Mix × (1−Dto Liq) × Exceso U.</w:t>
+        <w:t xml:space="preserve">= Lista Mix × (1−Dto Liq) ×</w:t>
+      </w:r>
+      <w:r>
+        <w:t xml:space="preserve"> </w:t>
+      </w:r>
+      <w:r>
+        <w:t xml:space="preserve">Exceso U.</w:t>
       </w:r>
     </w:p>
     <w:p>
@@ -790,7 +1036,13 @@
         <w:t xml:space="preserve"> </w:t>
       </w:r>
       <w:r>
-        <w:t xml:space="preserve">(sin ×estacionalidad). CMV = Costo × V.P. u. CMV/Vta = CMV/Venta.</w:t>
+        <w:t xml:space="preserve">(sin</w:t>
+      </w:r>
+      <w:r>
+        <w:t xml:space="preserve"> </w:t>
+      </w:r>
+      <w:r>
+        <w:t xml:space="preserve">×estacionalidad). CMV = Costo × V.P. u. CMV/Vta = CMV/Venta.</w:t>
       </w:r>
     </w:p>
     <w:p>
@@ -826,16 +1078,46 @@
         <w:t xml:space="preserve">”</w:t>
       </w:r>
       <w:r>
-        <w:t xml:space="preserve">. V.R. u = AB–AM del vivo (abs). V.P. $-USD = MIX × V.P. u.</w:t>
-      </w:r>
-      <w:r>
-        <w:t xml:space="preserve"> </w:t>
-      </w:r>
-      <w:r>
-        <w:rPr>
-          <w:b/>
-        </w:rPr>
-        <w:t xml:space="preserve">V.R. $-USD = venta real facturada del archivo V.R. mensual (USD para Importados, $ para Nacionales).</w:t>
+        <w:t xml:space="preserve">.</w:t>
+      </w:r>
+      <w:r>
+        <w:t xml:space="preserve"> </w:t>
+      </w:r>
+      <w:r>
+        <w:t xml:space="preserve">V.R. u = AB–AM del vivo (abs). V.P. $-USD = MIX × V.P. u.</w:t>
+      </w:r>
+      <w:r>
+        <w:t xml:space="preserve"> </w:t>
+      </w:r>
+      <w:r>
+        <w:rPr>
+          <w:b/>
+        </w:rPr>
+        <w:t xml:space="preserve">V.R.</w:t>
+      </w:r>
+      <w:r>
+        <w:rPr>
+          <w:b/>
+        </w:rPr>
+        <w:t xml:space="preserve"> </w:t>
+      </w:r>
+      <w:r>
+        <w:rPr>
+          <w:b/>
+        </w:rPr>
+        <w:t xml:space="preserve">$-USD = venta real facturada del archivo V.R. mensual (USD para</w:t>
+      </w:r>
+      <w:r>
+        <w:rPr>
+          <w:b/>
+        </w:rPr>
+        <w:t xml:space="preserve"> </w:t>
+      </w:r>
+      <w:r>
+        <w:rPr>
+          <w:b/>
+        </w:rPr>
+        <w:t xml:space="preserve">Importados, $ para Nacionales).</w:t>
       </w:r>
       <w:r>
         <w:t xml:space="preserve"> </w:t>
@@ -863,7 +1145,13 @@
         <w:pStyle w:val="Compact"/>
       </w:pPr>
       <w:r>
-        <w:t xml:space="preserve">Encabezado azul, letra blanca, línea amarilla como corte entre encabezado y datos (Liquidación invertido: amarillo/letra azul).</w:t>
+        <w:t xml:space="preserve">Encabezado azul, letra blanca, línea amarilla como corte entre</w:t>
+      </w:r>
+      <w:r>
+        <w:t xml:space="preserve"> </w:t>
+      </w:r>
+      <w:r>
+        <w:t xml:space="preserve">encabezado y datos (Liquidación invertido: amarillo/letra azul).</w:t>
       </w:r>
     </w:p>
     <w:p>
@@ -875,7 +1163,13 @@
         <w:pStyle w:val="Compact"/>
       </w:pPr>
       <w:r>
-        <w:t xml:space="preserve">Totales: gris claro, letra negra, importes con su color (Costo rojo, Mix/Obj verde).</w:t>
+        <w:t xml:space="preserve">Totales: gris claro, letra negra, importes con su color (Costo rojo,</w:t>
+      </w:r>
+      <w:r>
+        <w:t xml:space="preserve"> </w:t>
+      </w:r>
+      <w:r>
+        <w:t xml:space="preserve">Mix/Obj verde).</w:t>
       </w:r>
     </w:p>
     <w:p>
@@ -887,7 +1181,13 @@
         <w:pStyle w:val="Compact"/>
       </w:pPr>
       <w:r>
-        <w:t xml:space="preserve">Excels de descarga idénticos al preview, con formato Contabilidad USD / $.</w:t>
+        <w:t xml:space="preserve">Excels de descarga idénticos al preview, con formato Contabilidad</w:t>
+      </w:r>
+      <w:r>
+        <w:t xml:space="preserve"> </w:t>
+      </w:r>
+      <w:r>
+        <w:t xml:space="preserve">USD / $.</w:t>
       </w:r>
     </w:p>
     <w:p>
@@ -927,7 +1227,13 @@
         <w:t xml:space="preserve">“</w:t>
       </w:r>
       <w:r>
-        <w:t xml:space="preserve">Forecast MM-AA</w:t>
+        <w:t xml:space="preserve">Forecast</w:t>
+      </w:r>
+      <w:r>
+        <w:t xml:space="preserve"> </w:t>
+      </w:r>
+      <w:r>
+        <w:t xml:space="preserve">MM-AA</w:t>
       </w:r>
       <w:r>
         <w:t xml:space="preserve">”</w:t>
@@ -957,7 +1263,13 @@
         <w:t xml:space="preserve"> </w:t>
       </w:r>
       <w:r>
-        <w:t xml:space="preserve">memoizado; debounce en filtros; cacheo por pestaña; ventana de 4 meses por vista.</w:t>
+        <w:t xml:space="preserve">memoizado; debounce en filtros; cacheo por pestaña;</w:t>
+      </w:r>
+      <w:r>
+        <w:t xml:space="preserve"> </w:t>
+      </w:r>
+      <w:r>
+        <w:t xml:space="preserve">ventana de 4 meses por vista.</w:t>
       </w:r>
     </w:p>
     <w:p>
@@ -1021,7 +1333,13 @@
         <w:t xml:space="preserve"> </w:t>
       </w:r>
       <w:r>
-        <w:t xml:space="preserve">→ regenera y publica. Ctrl+F5 en la URL.</w:t>
+        <w:t xml:space="preserve">→ regenera y publica. Ctrl+F5</w:t>
+      </w:r>
+      <w:r>
+        <w:t xml:space="preserve"> </w:t>
+      </w:r>
+      <w:r>
+        <w:t xml:space="preserve">en la URL.</w:t>
       </w:r>
     </w:p>
     <w:p>
@@ -1039,7 +1357,19 @@
         <w:pStyle w:val="FirstParagraph"/>
       </w:pPr>
       <w:r>
-        <w:t xml:space="preserve">Dashboard_Forecast.html · Subir_a_GitHub.bat · .gitignore · generador/ (plantilla.html, generar_dashboard.py, historico_vp.json) · Memoria/ Prompt/ Skills/.</w:t>
+        <w:t xml:space="preserve">Dashboard_Forecast.html · Subir_a_GitHub.bat · .gitignore ·</w:t>
+      </w:r>
+      <w:r>
+        <w:t xml:space="preserve"> </w:t>
+      </w:r>
+      <w:r>
+        <w:t xml:space="preserve">generador/ (plantilla.html, generar_dashboard.py, historico_vp.json) ·</w:t>
+      </w:r>
+      <w:r>
+        <w:t xml:space="preserve"> </w:t>
+      </w:r>
+      <w:r>
+        <w:t xml:space="preserve">Memoria/ Prompt/ Skills/.</w:t>
       </w:r>
     </w:p>
     <w:sectPr/>

</xml_diff>